<commit_message>
correccion del informe perdido, y la parte practica
</commit_message>
<xml_diff>
--- a/Practicas/practica8-pruebasAutomatizadas/Práctica 8.docx
+++ b/Practicas/practica8-pruebasAutomatizadas/Práctica 8.docx
@@ -6,23 +6,13 @@
       <w:pPr>
         <w:spacing w:after="40"/>
       </w:pPr>
-      <w:proofErr w:type="gramStart"/>
       <w:r>
         <w:rPr>
           <w:b/>
           <w:bCs/>
           <w:color w:val="D97A2B"/>
         </w:rPr>
-        <w:t>PRÁCTICA N.º</w:t>
-      </w:r>
-      <w:proofErr w:type="gramEnd"/>
-      <w:r>
-        <w:rPr>
-          <w:b/>
-          <w:bCs/>
-          <w:color w:val="D97A2B"/>
-        </w:rPr>
-        <w:t xml:space="preserve"> 7 — HOJA DE EVIDENCIAS</w:t>
+        <w:t>PRÁCTICA N.º 7 — HOJA DE EVIDENCIAS</w:t>
       </w:r>
     </w:p>
     <w:p>
@@ -50,25 +40,7 @@
           <w:sz w:val="19"/>
           <w:szCs w:val="19"/>
         </w:rPr>
-        <w:t xml:space="preserve">COM-600 · Microservicios · Gestión 2/2026 · Tema 5 — Desarrollo con </w:t>
-      </w:r>
-      <w:proofErr w:type="spellStart"/>
-      <w:r>
-        <w:rPr>
-          <w:color w:val="5A6B78"/>
-          <w:sz w:val="19"/>
-          <w:szCs w:val="19"/>
-        </w:rPr>
-        <w:t>Frameworks</w:t>
-      </w:r>
-      <w:proofErr w:type="spellEnd"/>
-      <w:r>
-        <w:rPr>
-          <w:color w:val="5A6B78"/>
-          <w:sz w:val="19"/>
-          <w:szCs w:val="19"/>
-        </w:rPr>
-        <w:t xml:space="preserve"> y Pruebas Automatizadas</w:t>
+        <w:t>COM-600 · Microservicios · Gestión 2/2026 · Tema 5 — Desarrollo con Frameworks y Pruebas Automatizadas</w:t>
       </w:r>
     </w:p>
     <w:tbl>
@@ -93,12 +65,6 @@
         <w:gridCol w:w="7146"/>
       </w:tblGrid>
       <w:tr>
-        <w:tblPrEx>
-          <w:tblCellMar>
-            <w:top w:w="0" w:type="dxa"/>
-            <w:bottom w:w="0" w:type="dxa"/>
-          </w:tblCellMar>
-        </w:tblPrEx>
         <w:tc>
           <w:tcPr>
             <w:tcW w:w="2600" w:type="dxa"/>
@@ -134,16 +100,14 @@
             </w:tcMar>
             <w:vAlign w:val="center"/>
           </w:tcPr>
-          <w:p/>
+          <w:p>
+            <w:r>
+              <w:t>Cruz Grimaldez Manuel Dominique</w:t>
+            </w:r>
+          </w:p>
         </w:tc>
       </w:tr>
       <w:tr>
-        <w:tblPrEx>
-          <w:tblCellMar>
-            <w:top w:w="0" w:type="dxa"/>
-            <w:bottom w:w="0" w:type="dxa"/>
-          </w:tblCellMar>
-        </w:tblPrEx>
         <w:tc>
           <w:tcPr>
             <w:tcW w:w="2600" w:type="dxa"/>
@@ -179,16 +143,14 @@
             </w:tcMar>
             <w:vAlign w:val="center"/>
           </w:tcPr>
-          <w:p/>
+          <w:p>
+            <w:r>
+              <w:t>35-4879</w:t>
+            </w:r>
+          </w:p>
         </w:tc>
       </w:tr>
       <w:tr>
-        <w:tblPrEx>
-          <w:tblCellMar>
-            <w:top w:w="0" w:type="dxa"/>
-            <w:bottom w:w="0" w:type="dxa"/>
-          </w:tblCellMar>
-        </w:tblPrEx>
         <w:tc>
           <w:tcPr>
             <w:tcW w:w="2600" w:type="dxa"/>
@@ -224,16 +186,14 @@
             </w:tcMar>
             <w:vAlign w:val="center"/>
           </w:tcPr>
-          <w:p/>
+          <w:p>
+            <w:r>
+              <w:t>Ing sistemas</w:t>
+            </w:r>
+          </w:p>
         </w:tc>
       </w:tr>
       <w:tr>
-        <w:tblPrEx>
-          <w:tblCellMar>
-            <w:top w:w="0" w:type="dxa"/>
-            <w:bottom w:w="0" w:type="dxa"/>
-          </w:tblCellMar>
-        </w:tblPrEx>
         <w:tc>
           <w:tcPr>
             <w:tcW w:w="2600" w:type="dxa"/>
@@ -269,16 +229,17 @@
             </w:tcMar>
             <w:vAlign w:val="center"/>
           </w:tcPr>
-          <w:p/>
+          <w:p>
+            <w:r>
+              <w:t>08/10/2026</w:t>
+            </w:r>
+          </w:p>
         </w:tc>
       </w:tr>
       <w:tr>
-        <w:tblPrEx>
-          <w:tblCellMar>
-            <w:top w:w="0" w:type="dxa"/>
-            <w:bottom w:w="0" w:type="dxa"/>
-          </w:tblCellMar>
-        </w:tblPrEx>
+        <w:trPr>
+          <w:trHeight w:val="438"/>
+        </w:trPr>
         <w:tc>
           <w:tcPr>
             <w:tcW w:w="2600" w:type="dxa"/>
@@ -314,16 +275,14 @@
             </w:tcMar>
             <w:vAlign w:val="center"/>
           </w:tcPr>
-          <w:p/>
+          <w:p>
+            <w:r>
+              <w:t>Windows 11, Node v24.19.0, Docker 29.6.2</w:t>
+            </w:r>
+          </w:p>
         </w:tc>
       </w:tr>
       <w:tr>
-        <w:tblPrEx>
-          <w:tblCellMar>
-            <w:top w:w="0" w:type="dxa"/>
-            <w:bottom w:w="0" w:type="dxa"/>
-          </w:tblCellMar>
-        </w:tblPrEx>
         <w:tc>
           <w:tcPr>
             <w:tcW w:w="2600" w:type="dxa"/>
@@ -359,7 +318,16 @@
             </w:tcMar>
             <w:vAlign w:val="center"/>
           </w:tcPr>
-          <w:p/>
+          <w:p>
+            <w:hyperlink r:id="rId7" w:history="1">
+              <w:r>
+                <w:rPr>
+                  <w:rStyle w:val="Hipervnculo"/>
+                </w:rPr>
+                <w:t>https://github.com/dominique01Cruz/Cruz.Manuel-Com600-2-26/tree/0f27f96fe7b18fd327dc59d37ecad61eeb844304/Practicas/practica8-pruebasAutomatizadas</w:t>
+              </w:r>
+            </w:hyperlink>
+          </w:p>
         </w:tc>
       </w:tr>
     </w:tbl>
@@ -389,12 +357,6 @@
         <w:gridCol w:w="9746"/>
       </w:tblGrid>
       <w:tr>
-        <w:tblPrEx>
-          <w:tblCellMar>
-            <w:top w:w="0" w:type="dxa"/>
-            <w:bottom w:w="0" w:type="dxa"/>
-          </w:tblCellMar>
-        </w:tblPrEx>
         <w:tc>
           <w:tcPr>
             <w:tcW w:w="9746" w:type="dxa"/>
@@ -496,12 +458,6 @@
         <w:gridCol w:w="1546"/>
       </w:tblGrid>
       <w:tr>
-        <w:tblPrEx>
-          <w:tblCellMar>
-            <w:top w:w="0" w:type="dxa"/>
-            <w:bottom w:w="0" w:type="dxa"/>
-          </w:tblCellMar>
-        </w:tblPrEx>
         <w:trPr>
           <w:tblHeader/>
         </w:trPr>
@@ -615,12 +571,6 @@
         </w:tc>
       </w:tr>
       <w:tr>
-        <w:tblPrEx>
-          <w:tblCellMar>
-            <w:top w:w="0" w:type="dxa"/>
-            <w:bottom w:w="0" w:type="dxa"/>
-          </w:tblCellMar>
-        </w:tblPrEx>
         <w:tc>
           <w:tcPr>
             <w:tcW w:w="5200" w:type="dxa"/>
@@ -695,16 +645,14 @@
             </w:tcMar>
             <w:vAlign w:val="center"/>
           </w:tcPr>
-          <w:p/>
+          <w:p>
+            <w:r>
+              <w:t>X</w:t>
+            </w:r>
+          </w:p>
         </w:tc>
       </w:tr>
       <w:tr>
-        <w:tblPrEx>
-          <w:tblCellMar>
-            <w:top w:w="0" w:type="dxa"/>
-            <w:bottom w:w="0" w:type="dxa"/>
-          </w:tblCellMar>
-        </w:tblPrEx>
         <w:tc>
           <w:tcPr>
             <w:tcW w:w="5200" w:type="dxa"/>
@@ -779,16 +727,14 @@
             </w:tcMar>
             <w:vAlign w:val="center"/>
           </w:tcPr>
-          <w:p/>
+          <w:p>
+            <w:r>
+              <w:t>X</w:t>
+            </w:r>
+          </w:p>
         </w:tc>
       </w:tr>
       <w:tr>
-        <w:tblPrEx>
-          <w:tblCellMar>
-            <w:top w:w="0" w:type="dxa"/>
-            <w:bottom w:w="0" w:type="dxa"/>
-          </w:tblCellMar>
-        </w:tblPrEx>
         <w:tc>
           <w:tcPr>
             <w:tcW w:w="5200" w:type="dxa"/>
@@ -863,16 +809,14 @@
             </w:tcMar>
             <w:vAlign w:val="center"/>
           </w:tcPr>
-          <w:p/>
+          <w:p>
+            <w:r>
+              <w:t>X</w:t>
+            </w:r>
+          </w:p>
         </w:tc>
       </w:tr>
       <w:tr>
-        <w:tblPrEx>
-          <w:tblCellMar>
-            <w:top w:w="0" w:type="dxa"/>
-            <w:bottom w:w="0" w:type="dxa"/>
-          </w:tblCellMar>
-        </w:tblPrEx>
         <w:tc>
           <w:tcPr>
             <w:tcW w:w="5200" w:type="dxa"/>
@@ -947,16 +891,14 @@
             </w:tcMar>
             <w:vAlign w:val="center"/>
           </w:tcPr>
-          <w:p/>
+          <w:p>
+            <w:r>
+              <w:t>X</w:t>
+            </w:r>
+          </w:p>
         </w:tc>
       </w:tr>
       <w:tr>
-        <w:tblPrEx>
-          <w:tblCellMar>
-            <w:top w:w="0" w:type="dxa"/>
-            <w:bottom w:w="0" w:type="dxa"/>
-          </w:tblCellMar>
-        </w:tblPrEx>
         <w:tc>
           <w:tcPr>
             <w:tcW w:w="5200" w:type="dxa"/>
@@ -974,29 +916,74 @@
                 <w:sz w:val="18"/>
                 <w:szCs w:val="18"/>
               </w:rPr>
-              <w:t xml:space="preserve">Laboratorio 4 — Probar el </w:t>
-            </w:r>
-            <w:proofErr w:type="spellStart"/>
+              <w:t>Laboratorio 4 — Probar el endpoint HTTP sin levantar el servidor</w:t>
+            </w:r>
+          </w:p>
+        </w:tc>
+        <w:tc>
+          <w:tcPr>
+            <w:tcW w:w="1500" w:type="dxa"/>
+            <w:tcMar>
+              <w:top w:w="60" w:type="dxa"/>
+              <w:left w:w="100" w:type="dxa"/>
+              <w:bottom w:w="60" w:type="dxa"/>
+              <w:right w:w="100" w:type="dxa"/>
+            </w:tcMar>
+            <w:vAlign w:val="center"/>
+          </w:tcPr>
+          <w:p>
             <w:r>
               <w:rPr>
                 <w:sz w:val="18"/>
                 <w:szCs w:val="18"/>
               </w:rPr>
-              <w:t>endpoint</w:t>
-            </w:r>
-            <w:proofErr w:type="spellEnd"/>
+              <w:t>8, 9</w:t>
+            </w:r>
+          </w:p>
+        </w:tc>
+        <w:tc>
+          <w:tcPr>
+            <w:tcW w:w="1500" w:type="dxa"/>
+            <w:tcMar>
+              <w:top w:w="60" w:type="dxa"/>
+              <w:left w:w="100" w:type="dxa"/>
+              <w:bottom w:w="60" w:type="dxa"/>
+              <w:right w:w="100" w:type="dxa"/>
+            </w:tcMar>
+            <w:vAlign w:val="center"/>
+          </w:tcPr>
+          <w:p>
             <w:r>
               <w:rPr>
                 <w:sz w:val="18"/>
                 <w:szCs w:val="18"/>
               </w:rPr>
-              <w:t xml:space="preserve"> HTTP sin levantar el servidor</w:t>
-            </w:r>
-          </w:p>
-        </w:tc>
-        <w:tc>
-          <w:tcPr>
-            <w:tcW w:w="1500" w:type="dxa"/>
+              <w:t>—</w:t>
+            </w:r>
+          </w:p>
+        </w:tc>
+        <w:tc>
+          <w:tcPr>
+            <w:tcW w:w="1546" w:type="dxa"/>
+            <w:tcMar>
+              <w:top w:w="60" w:type="dxa"/>
+              <w:left w:w="100" w:type="dxa"/>
+              <w:bottom w:w="60" w:type="dxa"/>
+              <w:right w:w="100" w:type="dxa"/>
+            </w:tcMar>
+            <w:vAlign w:val="center"/>
+          </w:tcPr>
+          <w:p>
+            <w:r>
+              <w:t>X</w:t>
+            </w:r>
+          </w:p>
+        </w:tc>
+      </w:tr>
+      <w:tr>
+        <w:tc>
+          <w:tcPr>
+            <w:tcW w:w="5200" w:type="dxa"/>
             <w:tcMar>
               <w:top w:w="60" w:type="dxa"/>
               <w:left w:w="100" w:type="dxa"/>
@@ -1011,7 +998,7 @@
                 <w:sz w:val="18"/>
                 <w:szCs w:val="18"/>
               </w:rPr>
-              <w:t>8, 9</w:t>
+              <w:t>Laboratorio 5 — Integración real con un contenedor efímero</w:t>
             </w:r>
           </w:p>
         </w:tc>
@@ -1032,7 +1019,28 @@
                 <w:sz w:val="18"/>
                 <w:szCs w:val="18"/>
               </w:rPr>
-              <w:t>—</w:t>
+              <w:t>10, 11</w:t>
+            </w:r>
+          </w:p>
+        </w:tc>
+        <w:tc>
+          <w:tcPr>
+            <w:tcW w:w="1500" w:type="dxa"/>
+            <w:tcMar>
+              <w:top w:w="60" w:type="dxa"/>
+              <w:left w:w="100" w:type="dxa"/>
+              <w:bottom w:w="60" w:type="dxa"/>
+              <w:right w:w="100" w:type="dxa"/>
+            </w:tcMar>
+            <w:vAlign w:val="center"/>
+          </w:tcPr>
+          <w:p>
+            <w:r>
+              <w:rPr>
+                <w:sz w:val="18"/>
+                <w:szCs w:val="18"/>
+              </w:rPr>
+              <w:t>5</w:t>
             </w:r>
           </w:p>
         </w:tc>
@@ -1047,16 +1055,14 @@
             </w:tcMar>
             <w:vAlign w:val="center"/>
           </w:tcPr>
-          <w:p/>
+          <w:p>
+            <w:r>
+              <w:t>X</w:t>
+            </w:r>
+          </w:p>
         </w:tc>
       </w:tr>
       <w:tr>
-        <w:tblPrEx>
-          <w:tblCellMar>
-            <w:top w:w="0" w:type="dxa"/>
-            <w:bottom w:w="0" w:type="dxa"/>
-          </w:tblCellMar>
-        </w:tblPrEx>
         <w:tc>
           <w:tcPr>
             <w:tcW w:w="5200" w:type="dxa"/>
@@ -1074,7 +1080,7 @@
                 <w:sz w:val="18"/>
                 <w:szCs w:val="18"/>
               </w:rPr>
-              <w:t>Laboratorio 5 — Integración real con un contenedor efímero</w:t>
+              <w:t>Laboratorio 6 — Prueba de contrato entre dos servicios</w:t>
             </w:r>
           </w:p>
         </w:tc>
@@ -1095,7 +1101,7 @@
                 <w:sz w:val="18"/>
                 <w:szCs w:val="18"/>
               </w:rPr>
-              <w:t>10, 11</w:t>
+              <w:t>12, 13</w:t>
             </w:r>
           </w:p>
         </w:tc>
@@ -1116,7 +1122,7 @@
                 <w:sz w:val="18"/>
                 <w:szCs w:val="18"/>
               </w:rPr>
-              <w:t>5</w:t>
+              <w:t>6</w:t>
             </w:r>
           </w:p>
         </w:tc>
@@ -1131,16 +1137,14 @@
             </w:tcMar>
             <w:vAlign w:val="center"/>
           </w:tcPr>
-          <w:p/>
+          <w:p>
+            <w:r>
+              <w:t>X</w:t>
+            </w:r>
+          </w:p>
         </w:tc>
       </w:tr>
       <w:tr>
-        <w:tblPrEx>
-          <w:tblCellMar>
-            <w:top w:w="0" w:type="dxa"/>
-            <w:bottom w:w="0" w:type="dxa"/>
-          </w:tblCellMar>
-        </w:tblPrEx>
         <w:tc>
           <w:tcPr>
             <w:tcW w:w="5200" w:type="dxa"/>
@@ -1158,7 +1162,7 @@
                 <w:sz w:val="18"/>
                 <w:szCs w:val="18"/>
               </w:rPr>
-              <w:t>Laboratorio 6 — Prueba de contrato entre dos servicios</w:t>
+              <w:t>Laboratorio 7 — Dejar el proyecto listo para el pipeline</w:t>
             </w:r>
           </w:p>
         </w:tc>
@@ -1179,7 +1183,7 @@
                 <w:sz w:val="18"/>
                 <w:szCs w:val="18"/>
               </w:rPr>
-              <w:t>12, 13</w:t>
+              <w:t>14, 15</w:t>
             </w:r>
           </w:p>
         </w:tc>
@@ -1200,7 +1204,7 @@
                 <w:sz w:val="18"/>
                 <w:szCs w:val="18"/>
               </w:rPr>
-              <w:t>6</w:t>
+              <w:t>7</w:t>
             </w:r>
           </w:p>
         </w:tc>
@@ -1215,91 +1219,11 @@
             </w:tcMar>
             <w:vAlign w:val="center"/>
           </w:tcPr>
-          <w:p/>
-        </w:tc>
-      </w:tr>
-      <w:tr>
-        <w:tblPrEx>
-          <w:tblCellMar>
-            <w:top w:w="0" w:type="dxa"/>
-            <w:bottom w:w="0" w:type="dxa"/>
-          </w:tblCellMar>
-        </w:tblPrEx>
-        <w:tc>
-          <w:tcPr>
-            <w:tcW w:w="5200" w:type="dxa"/>
-            <w:tcMar>
-              <w:top w:w="60" w:type="dxa"/>
-              <w:left w:w="100" w:type="dxa"/>
-              <w:bottom w:w="60" w:type="dxa"/>
-              <w:right w:w="100" w:type="dxa"/>
-            </w:tcMar>
-            <w:vAlign w:val="center"/>
-          </w:tcPr>
-          <w:p>
-            <w:r>
-              <w:rPr>
-                <w:sz w:val="18"/>
-                <w:szCs w:val="18"/>
-              </w:rPr>
-              <w:t>Laboratorio 7 — Dejar el proyecto listo para el pipeline</w:t>
-            </w:r>
-          </w:p>
-        </w:tc>
-        <w:tc>
-          <w:tcPr>
-            <w:tcW w:w="1500" w:type="dxa"/>
-            <w:tcMar>
-              <w:top w:w="60" w:type="dxa"/>
-              <w:left w:w="100" w:type="dxa"/>
-              <w:bottom w:w="60" w:type="dxa"/>
-              <w:right w:w="100" w:type="dxa"/>
-            </w:tcMar>
-            <w:vAlign w:val="center"/>
-          </w:tcPr>
-          <w:p>
-            <w:r>
-              <w:rPr>
-                <w:sz w:val="18"/>
-                <w:szCs w:val="18"/>
-              </w:rPr>
-              <w:t>14, 15</w:t>
-            </w:r>
-          </w:p>
-        </w:tc>
-        <w:tc>
-          <w:tcPr>
-            <w:tcW w:w="1500" w:type="dxa"/>
-            <w:tcMar>
-              <w:top w:w="60" w:type="dxa"/>
-              <w:left w:w="100" w:type="dxa"/>
-              <w:bottom w:w="60" w:type="dxa"/>
-              <w:right w:w="100" w:type="dxa"/>
-            </w:tcMar>
-            <w:vAlign w:val="center"/>
-          </w:tcPr>
-          <w:p>
-            <w:r>
-              <w:rPr>
-                <w:sz w:val="18"/>
-                <w:szCs w:val="18"/>
-              </w:rPr>
-              <w:t>7</w:t>
-            </w:r>
-          </w:p>
-        </w:tc>
-        <w:tc>
-          <w:tcPr>
-            <w:tcW w:w="1546" w:type="dxa"/>
-            <w:tcMar>
-              <w:top w:w="60" w:type="dxa"/>
-              <w:left w:w="100" w:type="dxa"/>
-              <w:bottom w:w="60" w:type="dxa"/>
-              <w:right w:w="100" w:type="dxa"/>
-            </w:tcMar>
-            <w:vAlign w:val="center"/>
-          </w:tcPr>
-          <w:p/>
+          <w:p>
+            <w:r>
+              <w:t>X</w:t>
+            </w:r>
+          </w:p>
         </w:tc>
       </w:tr>
     </w:tbl>
@@ -1379,12 +1303,6 @@
         <w:gridCol w:w="9950"/>
       </w:tblGrid>
       <w:tr>
-        <w:tblPrEx>
-          <w:tblCellMar>
-            <w:top w:w="0" w:type="dxa"/>
-            <w:bottom w:w="0" w:type="dxa"/>
-          </w:tblCellMar>
-        </w:tblPrEx>
         <w:trPr>
           <w:trHeight w:val="2100"/>
         </w:trPr>
@@ -1408,6 +1326,7 @@
               <w:rPr>
                 <w:i/>
                 <w:iCs/>
+                <w:noProof/>
                 <w:color w:val="8F9EAA"/>
               </w:rPr>
               <w:lastRenderedPageBreak/>
@@ -1427,7 +1346,7 @@
                           <pic:cNvPicPr/>
                         </pic:nvPicPr>
                         <pic:blipFill>
-                          <a:blip r:embed="rId7"/>
+                          <a:blip r:embed="rId8"/>
                           <a:stretch>
                             <a:fillRect/>
                           </a:stretch>
@@ -1461,23 +1380,13 @@
         <w:spacing w:after="80" w:line="260" w:lineRule="auto"/>
         <w:jc w:val="both"/>
       </w:pPr>
-      <w:proofErr w:type="gramStart"/>
       <w:r>
         <w:rPr>
           <w:b/>
           <w:bCs/>
           <w:color w:val="0F3D5C"/>
         </w:rPr>
-        <w:t>Pregunta N.º</w:t>
-      </w:r>
-      <w:proofErr w:type="gramEnd"/>
-      <w:r>
-        <w:rPr>
-          <w:b/>
-          <w:bCs/>
-          <w:color w:val="0F3D5C"/>
-        </w:rPr>
-        <w:t xml:space="preserve"> 1. </w:t>
+        <w:t xml:space="preserve">Pregunta N.º 1. </w:t>
       </w:r>
       <w:r>
         <w:rPr>
@@ -1508,12 +1417,6 @@
         <w:gridCol w:w="9746"/>
       </w:tblGrid>
       <w:tr>
-        <w:tblPrEx>
-          <w:tblCellMar>
-            <w:top w:w="0" w:type="dxa"/>
-            <w:bottom w:w="0" w:type="dxa"/>
-          </w:tblCellMar>
-        </w:tblPrEx>
         <w:trPr>
           <w:trHeight w:val="1400"/>
         </w:trPr>
@@ -1555,33 +1458,7 @@
         <w:t xml:space="preserve">Captura N.º 2: </w:t>
       </w:r>
       <w:r>
-        <w:t xml:space="preserve">salida de </w:t>
-      </w:r>
-      <w:proofErr w:type="spellStart"/>
-      <w:r>
-        <w:t>npm</w:t>
-      </w:r>
-      <w:proofErr w:type="spellEnd"/>
-      <w:r>
-        <w:t xml:space="preserve"> </w:t>
-      </w:r>
-      <w:proofErr w:type="spellStart"/>
-      <w:r>
-        <w:t>install</w:t>
-      </w:r>
-      <w:proofErr w:type="spellEnd"/>
-      <w:r>
-        <w:t xml:space="preserve"> mostrando los paquetes instalados y el archivo </w:t>
-      </w:r>
-      <w:proofErr w:type="spellStart"/>
-      <w:proofErr w:type="gramStart"/>
-      <w:r>
-        <w:t>package.json</w:t>
-      </w:r>
-      <w:proofErr w:type="spellEnd"/>
-      <w:proofErr w:type="gramEnd"/>
-      <w:r>
-        <w:t xml:space="preserve"> creado.</w:t>
+        <w:t>salida de npm install mostrando los paquetes instalados y el archivo package.json creado.</w:t>
       </w:r>
     </w:p>
     <w:tbl>
@@ -1605,12 +1482,6 @@
         <w:gridCol w:w="9950"/>
       </w:tblGrid>
       <w:tr>
-        <w:tblPrEx>
-          <w:tblCellMar>
-            <w:top w:w="0" w:type="dxa"/>
-            <w:bottom w:w="0" w:type="dxa"/>
-          </w:tblCellMar>
-        </w:tblPrEx>
         <w:trPr>
           <w:trHeight w:val="2100"/>
         </w:trPr>
@@ -1634,6 +1505,7 @@
               <w:rPr>
                 <w:i/>
                 <w:iCs/>
+                <w:noProof/>
                 <w:color w:val="8F9EAA"/>
               </w:rPr>
               <w:drawing>
@@ -1652,7 +1524,7 @@
                           <pic:cNvPicPr/>
                         </pic:nvPicPr>
                         <pic:blipFill>
-                          <a:blip r:embed="rId8"/>
+                          <a:blip r:embed="rId9"/>
                           <a:stretch>
                             <a:fillRect/>
                           </a:stretch>
@@ -1713,15 +1585,7 @@
         <w:t xml:space="preserve">Captura N.º 3: </w:t>
       </w:r>
       <w:r>
-        <w:t xml:space="preserve">salida de </w:t>
-      </w:r>
-      <w:proofErr w:type="spellStart"/>
-      <w:r>
-        <w:t>npm</w:t>
-      </w:r>
-      <w:proofErr w:type="spellEnd"/>
-      <w:r>
-        <w:t xml:space="preserve"> test con la primera prueba pasando en verde.</w:t>
+        <w:t>salida de npm test con la primera prueba pasando en verde.</w:t>
       </w:r>
     </w:p>
     <w:tbl>
@@ -1745,12 +1609,6 @@
         <w:gridCol w:w="9950"/>
       </w:tblGrid>
       <w:tr>
-        <w:tblPrEx>
-          <w:tblCellMar>
-            <w:top w:w="0" w:type="dxa"/>
-            <w:bottom w:w="0" w:type="dxa"/>
-          </w:tblCellMar>
-        </w:tblPrEx>
         <w:trPr>
           <w:trHeight w:val="2100"/>
         </w:trPr>
@@ -1774,6 +1632,7 @@
               <w:rPr>
                 <w:i/>
                 <w:iCs/>
+                <w:noProof/>
                 <w:color w:val="8F9EAA"/>
               </w:rPr>
               <w:lastRenderedPageBreak/>
@@ -1793,7 +1652,7 @@
                           <pic:cNvPicPr/>
                         </pic:nvPicPr>
                         <pic:blipFill>
-                          <a:blip r:embed="rId9"/>
+                          <a:blip r:embed="rId10"/>
                           <a:stretch>
                             <a:fillRect/>
                           </a:stretch>
@@ -1827,23 +1686,13 @@
         <w:spacing w:after="80" w:line="260" w:lineRule="auto"/>
         <w:jc w:val="both"/>
       </w:pPr>
-      <w:proofErr w:type="gramStart"/>
       <w:r>
         <w:rPr>
           <w:b/>
           <w:bCs/>
           <w:color w:val="0F3D5C"/>
         </w:rPr>
-        <w:t>Pregunta N.º</w:t>
-      </w:r>
-      <w:proofErr w:type="gramEnd"/>
-      <w:r>
-        <w:rPr>
-          <w:b/>
-          <w:bCs/>
-          <w:color w:val="0F3D5C"/>
-        </w:rPr>
-        <w:t xml:space="preserve"> 2. </w:t>
+        <w:t xml:space="preserve">Pregunta N.º 2. </w:t>
       </w:r>
       <w:r>
         <w:rPr>
@@ -1874,12 +1723,6 @@
         <w:gridCol w:w="9746"/>
       </w:tblGrid>
       <w:tr>
-        <w:tblPrEx>
-          <w:tblCellMar>
-            <w:top w:w="0" w:type="dxa"/>
-            <w:bottom w:w="0" w:type="dxa"/>
-          </w:tblCellMar>
-        </w:tblPrEx>
         <w:trPr>
           <w:trHeight w:val="1400"/>
         </w:trPr>
@@ -1896,15 +1739,7 @@
           </w:tcPr>
           <w:p>
             <w:r>
-              <w:t xml:space="preserve">Gana diagnóstico inmediato: al ver el nombre en rojo, el equipo sabe exactamente qué comportamiento se rompió sin leer el código de la prueba ni </w:t>
-            </w:r>
-            <w:proofErr w:type="gramStart"/>
-            <w:r>
-              <w:t>el fuente</w:t>
-            </w:r>
-            <w:proofErr w:type="gramEnd"/>
-            <w:r>
-              <w:t>. Ahorra tiempo, comunica la falla a cualquiera (incluso a alguien nuevo), permite priorizar según la regla de negocio afectada y conecta la prueba con un requisito concreto. Un nombre descriptivo convierte una falla en un mensaje accionable; test1 obliga a investigar desde cero.</w:t>
+              <w:t>Gana diagnóstico inmediato: al ver el nombre en rojo, el equipo sabe exactamente qué comportamiento se rompió sin leer el código de la prueba ni el fuente. Ahorra tiempo, comunica la falla a cualquiera (incluso a alguien nuevo), permite priorizar según la regla de negocio afectada y conecta la prueba con un requisito concreto. Un nombre descriptivo convierte una falla en un mensaje accionable; test1 obliga a investigar desde cero.</w:t>
             </w:r>
           </w:p>
           <w:p/>
@@ -1948,15 +1783,7 @@
         <w:t xml:space="preserve">Captura N.º 4: </w:t>
       </w:r>
       <w:r>
-        <w:t xml:space="preserve">salida de </w:t>
-      </w:r>
-      <w:proofErr w:type="spellStart"/>
-      <w:r>
-        <w:t>npm</w:t>
-      </w:r>
-      <w:proofErr w:type="spellEnd"/>
-      <w:r>
-        <w:t xml:space="preserve"> test con las cuatro pruebas del bloque en verde.</w:t>
+        <w:t>salida de npm test con las cuatro pruebas del bloque en verde.</w:t>
       </w:r>
     </w:p>
     <w:tbl>
@@ -1980,12 +1807,6 @@
         <w:gridCol w:w="9950"/>
       </w:tblGrid>
       <w:tr>
-        <w:tblPrEx>
-          <w:tblCellMar>
-            <w:top w:w="0" w:type="dxa"/>
-            <w:bottom w:w="0" w:type="dxa"/>
-          </w:tblCellMar>
-        </w:tblPrEx>
         <w:trPr>
           <w:trHeight w:val="2100"/>
         </w:trPr>
@@ -2009,6 +1830,7 @@
               <w:rPr>
                 <w:i/>
                 <w:iCs/>
+                <w:noProof/>
                 <w:color w:val="8F9EAA"/>
               </w:rPr>
               <w:lastRenderedPageBreak/>
@@ -2028,7 +1850,7 @@
                           <pic:cNvPicPr/>
                         </pic:nvPicPr>
                         <pic:blipFill>
-                          <a:blip r:embed="rId10"/>
+                          <a:blip r:embed="rId11"/>
                           <a:stretch>
                             <a:fillRect/>
                           </a:stretch>
@@ -2095,12 +1917,6 @@
         <w:gridCol w:w="9950"/>
       </w:tblGrid>
       <w:tr>
-        <w:tblPrEx>
-          <w:tblCellMar>
-            <w:top w:w="0" w:type="dxa"/>
-            <w:bottom w:w="0" w:type="dxa"/>
-          </w:tblCellMar>
-        </w:tblPrEx>
         <w:trPr>
           <w:trHeight w:val="2100"/>
         </w:trPr>
@@ -2124,6 +1940,7 @@
               <w:rPr>
                 <w:i/>
                 <w:iCs/>
+                <w:noProof/>
                 <w:color w:val="8F9EAA"/>
               </w:rPr>
               <w:lastRenderedPageBreak/>
@@ -2143,7 +1960,7 @@
                           <pic:cNvPicPr/>
                         </pic:nvPicPr>
                         <pic:blipFill>
-                          <a:blip r:embed="rId11"/>
+                          <a:blip r:embed="rId12"/>
                           <a:stretch>
                             <a:fillRect/>
                           </a:stretch>
@@ -2177,23 +1994,13 @@
         <w:spacing w:after="80" w:line="260" w:lineRule="auto"/>
         <w:jc w:val="both"/>
       </w:pPr>
-      <w:proofErr w:type="gramStart"/>
       <w:r>
         <w:rPr>
           <w:b/>
           <w:bCs/>
           <w:color w:val="0F3D5C"/>
         </w:rPr>
-        <w:t>Pregunta N.º</w:t>
-      </w:r>
-      <w:proofErr w:type="gramEnd"/>
-      <w:r>
-        <w:rPr>
-          <w:b/>
-          <w:bCs/>
-          <w:color w:val="0F3D5C"/>
-        </w:rPr>
-        <w:t xml:space="preserve"> 3. </w:t>
+        <w:t xml:space="preserve">Pregunta N.º 3. </w:t>
       </w:r>
       <w:r>
         <w:rPr>
@@ -2224,12 +2031,6 @@
         <w:gridCol w:w="9746"/>
       </w:tblGrid>
       <w:tr>
-        <w:tblPrEx>
-          <w:tblCellMar>
-            <w:top w:w="0" w:type="dxa"/>
-            <w:bottom w:w="0" w:type="dxa"/>
-          </w:tblCellMar>
-        </w:tblPrEx>
         <w:trPr>
           <w:trHeight w:val="1400"/>
         </w:trPr>
@@ -2296,6 +2097,96 @@
       </w:r>
       <w:r>
         <w:t>tabla de cobertura impresa en la terminal.</w:t>
+      </w:r>
+    </w:p>
+    <w:p>
+      <w:pPr>
+        <w:spacing w:after="80" w:line="260" w:lineRule="auto"/>
+        <w:jc w:val="both"/>
+        <w:rPr>
+          <w:b/>
+          <w:bCs/>
+          <w:color w:val="C00000"/>
+          <w:sz w:val="22"/>
+          <w:szCs w:val="22"/>
+        </w:rPr>
+      </w:pPr>
+      <w:r>
+        <w:rPr>
+          <w:b/>
+          <w:bCs/>
+          <w:color w:val="C00000"/>
+          <w:sz w:val="22"/>
+          <w:szCs w:val="22"/>
+          <w:highlight w:val="yellow"/>
+        </w:rPr>
+        <w:t>Complete el laboratorio</w:t>
+      </w:r>
+      <w:r>
+        <w:rPr>
+          <w:b/>
+          <w:bCs/>
+          <w:color w:val="C00000"/>
+          <w:sz w:val="22"/>
+          <w:szCs w:val="22"/>
+          <w:highlight w:val="yellow"/>
+        </w:rPr>
+        <w:t xml:space="preserve"> parte 1,</w:t>
+      </w:r>
+      <w:r>
+        <w:rPr>
+          <w:b/>
+          <w:bCs/>
+          <w:color w:val="C00000"/>
+          <w:sz w:val="22"/>
+          <w:szCs w:val="22"/>
+          <w:highlight w:val="yellow"/>
+        </w:rPr>
+        <w:t xml:space="preserve"> pero no se guardo el informe, las fotos serán bajo el conte</w:t>
+      </w:r>
+      <w:r>
+        <w:rPr>
+          <w:b/>
+          <w:bCs/>
+          <w:color w:val="C00000"/>
+          <w:sz w:val="22"/>
+          <w:szCs w:val="22"/>
+          <w:highlight w:val="yellow"/>
+        </w:rPr>
+        <w:t>x</w:t>
+      </w:r>
+      <w:r>
+        <w:rPr>
+          <w:b/>
+          <w:bCs/>
+          <w:color w:val="C00000"/>
+          <w:sz w:val="22"/>
+          <w:szCs w:val="22"/>
+          <w:highlight w:val="yellow"/>
+        </w:rPr>
+        <w:t xml:space="preserve">to del </w:t>
+      </w:r>
+      <w:r>
+        <w:rPr>
+          <w:b/>
+          <w:bCs/>
+          <w:color w:val="C00000"/>
+          <w:sz w:val="22"/>
+          <w:szCs w:val="22"/>
+          <w:highlight w:val="yellow"/>
+        </w:rPr>
+        <w:t>laboratorio</w:t>
+      </w:r>
+      <w:r>
+        <w:rPr>
+          <w:b/>
+          <w:bCs/>
+          <w:color w:val="C00000"/>
+          <w:sz w:val="22"/>
+          <w:szCs w:val="22"/>
+          <w:highlight w:val="yellow"/>
+        </w:rPr>
+        <w:t xml:space="preserve"> terminado:</w:t>
       </w:r>
     </w:p>
     <w:tbl>
@@ -2319,12 +2210,6 @@
         <w:gridCol w:w="9746"/>
       </w:tblGrid>
       <w:tr>
-        <w:tblPrEx>
-          <w:tblCellMar>
-            <w:top w:w="0" w:type="dxa"/>
-            <w:bottom w:w="0" w:type="dxa"/>
-          </w:tblCellMar>
-        </w:tblPrEx>
         <w:trPr>
           <w:trHeight w:val="2100"/>
         </w:trPr>
@@ -2348,20 +2233,46 @@
               <w:rPr>
                 <w:i/>
                 <w:iCs/>
+                <w:noProof/>
                 <w:color w:val="8F9EAA"/>
               </w:rPr>
-              <w:t xml:space="preserve">[ Pegue aquí la captura de </w:t>
-            </w:r>
-            <w:proofErr w:type="gramStart"/>
-            <w:r>
-              <w:rPr>
-                <w:i/>
-                <w:iCs/>
-                <w:color w:val="8F9EAA"/>
-              </w:rPr>
-              <w:t>pantalla ]</w:t>
-            </w:r>
-            <w:proofErr w:type="gramEnd"/>
+              <w:lastRenderedPageBreak/>
+              <w:drawing>
+                <wp:inline distT="0" distB="0" distL="0" distR="0" wp14:anchorId="495B63CF" wp14:editId="5210D630">
+                  <wp:extent cx="4496190" cy="2476715"/>
+                  <wp:effectExtent l="0" t="0" r="0" b="0"/>
+                  <wp:docPr id="1059089629" name="Imagen 1"/>
+                  <wp:cNvGraphicFramePr>
+                    <a:graphicFrameLocks xmlns:a="http://schemas.openxmlformats.org/drawingml/2006/main" noChangeAspect="1"/>
+                  </wp:cNvGraphicFramePr>
+                  <a:graphic xmlns:a="http://schemas.openxmlformats.org/drawingml/2006/main">
+                    <a:graphicData uri="http://schemas.openxmlformats.org/drawingml/2006/picture">
+                      <pic:pic xmlns:pic="http://schemas.openxmlformats.org/drawingml/2006/picture">
+                        <pic:nvPicPr>
+                          <pic:cNvPr id="1059089629" name=""/>
+                          <pic:cNvPicPr/>
+                        </pic:nvPicPr>
+                        <pic:blipFill>
+                          <a:blip r:embed="rId13"/>
+                          <a:stretch>
+                            <a:fillRect/>
+                          </a:stretch>
+                        </pic:blipFill>
+                        <pic:spPr>
+                          <a:xfrm>
+                            <a:off x="0" y="0"/>
+                            <a:ext cx="4496190" cy="2476715"/>
+                          </a:xfrm>
+                          <a:prstGeom prst="rect">
+                            <a:avLst/>
+                          </a:prstGeom>
+                        </pic:spPr>
+                      </pic:pic>
+                    </a:graphicData>
+                  </a:graphic>
+                </wp:inline>
+              </w:drawing>
+            </w:r>
           </w:p>
         </w:tc>
       </w:tr>
@@ -2385,15 +2296,1099 @@
         <w:t xml:space="preserve">Captura N.º 7: </w:t>
       </w:r>
       <w:r>
-        <w:t xml:space="preserve">reporte HTML de cobertura mostrando el archivo </w:t>
-      </w:r>
-      <w:proofErr w:type="spellStart"/>
-      <w:r>
-        <w:t>src</w:t>
-      </w:r>
-      <w:proofErr w:type="spellEnd"/>
-      <w:r>
-        <w:t>/tarea.js con sus líneas coloreadas.</w:t>
+        <w:t>reporte HTML de cobertura mostrando el archivo src/tarea.js con sus líneas coloreadas.</w:t>
+      </w:r>
+    </w:p>
+    <w:tbl>
+      <w:tblPr>
+        <w:tblW w:w="9746" w:type="dxa"/>
+        <w:tblBorders>
+          <w:top w:val="dashed" w:sz="4" w:space="0" w:color="D6DEE5"/>
+          <w:left w:val="dashed" w:sz="4" w:space="0" w:color="D6DEE5"/>
+          <w:bottom w:val="dashed" w:sz="4" w:space="0" w:color="D6DEE5"/>
+          <w:right w:val="dashed" w:sz="4" w:space="0" w:color="D6DEE5"/>
+          <w:insideH w:val="single" w:sz="4" w:space="0" w:color="auto"/>
+          <w:insideV w:val="single" w:sz="4" w:space="0" w:color="auto"/>
+        </w:tblBorders>
+        <w:tblCellMar>
+          <w:left w:w="10" w:type="dxa"/>
+          <w:right w:w="10" w:type="dxa"/>
+        </w:tblCellMar>
+        <w:tblLook w:val="04A0" w:firstRow="1" w:lastRow="0" w:firstColumn="1" w:lastColumn="0" w:noHBand="0" w:noVBand="1"/>
+      </w:tblPr>
+      <w:tblGrid>
+        <w:gridCol w:w="9950"/>
+      </w:tblGrid>
+      <w:tr>
+        <w:trPr>
+          <w:trHeight w:val="2100"/>
+        </w:trPr>
+        <w:tc>
+          <w:tcPr>
+            <w:tcW w:w="9746" w:type="dxa"/>
+            <w:tcMar>
+              <w:top w:w="60" w:type="dxa"/>
+              <w:left w:w="100" w:type="dxa"/>
+              <w:bottom w:w="60" w:type="dxa"/>
+              <w:right w:w="100" w:type="dxa"/>
+            </w:tcMar>
+            <w:vAlign w:val="center"/>
+          </w:tcPr>
+          <w:p>
+            <w:pPr>
+              <w:spacing w:before="800" w:after="800"/>
+              <w:jc w:val="center"/>
+            </w:pPr>
+            <w:r>
+              <w:rPr>
+                <w:i/>
+                <w:iCs/>
+                <w:noProof/>
+                <w:color w:val="8F9EAA"/>
+              </w:rPr>
+              <w:drawing>
+                <wp:inline distT="0" distB="0" distL="0" distR="0" wp14:anchorId="069A0C2E" wp14:editId="5ED1FFB9">
+                  <wp:extent cx="6188710" cy="1659890"/>
+                  <wp:effectExtent l="0" t="0" r="2540" b="0"/>
+                  <wp:docPr id="1324499417" name="Imagen 1"/>
+                  <wp:cNvGraphicFramePr>
+                    <a:graphicFrameLocks xmlns:a="http://schemas.openxmlformats.org/drawingml/2006/main" noChangeAspect="1"/>
+                  </wp:cNvGraphicFramePr>
+                  <a:graphic xmlns:a="http://schemas.openxmlformats.org/drawingml/2006/main">
+                    <a:graphicData uri="http://schemas.openxmlformats.org/drawingml/2006/picture">
+                      <pic:pic xmlns:pic="http://schemas.openxmlformats.org/drawingml/2006/picture">
+                        <pic:nvPicPr>
+                          <pic:cNvPr id="1324499417" name=""/>
+                          <pic:cNvPicPr/>
+                        </pic:nvPicPr>
+                        <pic:blipFill>
+                          <a:blip r:embed="rId14"/>
+                          <a:stretch>
+                            <a:fillRect/>
+                          </a:stretch>
+                        </pic:blipFill>
+                        <pic:spPr>
+                          <a:xfrm>
+                            <a:off x="0" y="0"/>
+                            <a:ext cx="6188710" cy="1659890"/>
+                          </a:xfrm>
+                          <a:prstGeom prst="rect">
+                            <a:avLst/>
+                          </a:prstGeom>
+                        </pic:spPr>
+                      </pic:pic>
+                    </a:graphicData>
+                  </a:graphic>
+                </wp:inline>
+              </w:drawing>
+            </w:r>
+          </w:p>
+        </w:tc>
+      </w:tr>
+    </w:tbl>
+    <w:p>
+      <w:pPr>
+        <w:spacing w:after="160"/>
+      </w:pPr>
+    </w:p>
+    <w:p>
+      <w:pPr>
+        <w:spacing w:after="80" w:line="260" w:lineRule="auto"/>
+        <w:jc w:val="both"/>
+      </w:pPr>
+      <w:r>
+        <w:rPr>
+          <w:b/>
+          <w:bCs/>
+          <w:color w:val="0F3D5C"/>
+        </w:rPr>
+        <w:t xml:space="preserve">Pregunta N.º 4. </w:t>
+      </w:r>
+      <w:r>
+        <w:rPr>
+          <w:b/>
+          <w:bCs/>
+        </w:rPr>
+        <w:t>Escriba una prueba que ejecute todas las líneas de estadoDeTarea pero que no verifique nada útil (por ejemplo, sin ningún expect que compare el resultado). ¿Qué cobertura reporta? ¿Qué conclusión saca sobre la cobertura como criterio de calidad?</w:t>
+      </w:r>
+    </w:p>
+    <w:tbl>
+      <w:tblPr>
+        <w:tblW w:w="9746" w:type="dxa"/>
+        <w:tblBorders>
+          <w:top w:val="single" w:sz="4" w:space="0" w:color="D6DEE5"/>
+          <w:left w:val="single" w:sz="4" w:space="0" w:color="D6DEE5"/>
+          <w:bottom w:val="single" w:sz="4" w:space="0" w:color="D6DEE5"/>
+          <w:right w:val="single" w:sz="4" w:space="0" w:color="D6DEE5"/>
+          <w:insideH w:val="single" w:sz="4" w:space="0" w:color="auto"/>
+          <w:insideV w:val="single" w:sz="4" w:space="0" w:color="auto"/>
+        </w:tblBorders>
+        <w:tblCellMar>
+          <w:left w:w="10" w:type="dxa"/>
+          <w:right w:w="10" w:type="dxa"/>
+        </w:tblCellMar>
+        <w:tblLook w:val="04A0" w:firstRow="1" w:lastRow="0" w:firstColumn="1" w:lastColumn="0" w:noHBand="0" w:noVBand="1"/>
+      </w:tblPr>
+      <w:tblGrid>
+        <w:gridCol w:w="9746"/>
+      </w:tblGrid>
+      <w:tr>
+        <w:trPr>
+          <w:trHeight w:val="1400"/>
+        </w:trPr>
+        <w:tc>
+          <w:tcPr>
+            <w:tcW w:w="9746" w:type="dxa"/>
+            <w:tcMar>
+              <w:top w:w="60" w:type="dxa"/>
+              <w:left w:w="100" w:type="dxa"/>
+              <w:bottom w:w="60" w:type="dxa"/>
+              <w:right w:w="100" w:type="dxa"/>
+            </w:tcMar>
+            <w:vAlign w:val="center"/>
+          </w:tcPr>
+          <w:p>
+            <w:r>
+              <w:t>Una prueba sin expect reporta igual 100% de cobertura, porque la cobertura mide líneas ejecutadas, no verificaciones. Conclusión: la cobertura no mide calidad, solo ejecución.</w:t>
+            </w:r>
+          </w:p>
+        </w:tc>
+      </w:tr>
+    </w:tbl>
+    <w:p>
+      <w:pPr>
+        <w:spacing w:after="160"/>
+      </w:pPr>
+    </w:p>
+    <w:p>
+      <w:pPr>
+        <w:pBdr>
+          <w:bottom w:val="single" w:sz="6" w:space="3" w:color="D6DEE5"/>
+        </w:pBdr>
+        <w:spacing w:before="300" w:after="120"/>
+      </w:pPr>
+      <w:r>
+        <w:rPr>
+          <w:b/>
+          <w:bCs/>
+          <w:color w:val="0F3D5C"/>
+          <w:sz w:val="24"/>
+          <w:szCs w:val="24"/>
+        </w:rPr>
+        <w:lastRenderedPageBreak/>
+        <w:t>Laboratorio 4 — Probar el endpoint HTTP sin levantar el servidor</w:t>
+      </w:r>
+    </w:p>
+    <w:p>
+      <w:pPr>
+        <w:spacing w:after="80" w:line="260" w:lineRule="auto"/>
+        <w:jc w:val="both"/>
+      </w:pPr>
+      <w:r>
+        <w:rPr>
+          <w:b/>
+          <w:bCs/>
+          <w:color w:val="D97A2B"/>
+        </w:rPr>
+        <w:t xml:space="preserve">Captura N.º 8: </w:t>
+      </w:r>
+      <w:r>
+        <w:t>salida de npm test con las pruebas de la API en verde.</w:t>
+      </w:r>
+    </w:p>
+    <w:tbl>
+      <w:tblPr>
+        <w:tblW w:w="9746" w:type="dxa"/>
+        <w:tblBorders>
+          <w:top w:val="dashed" w:sz="4" w:space="0" w:color="D6DEE5"/>
+          <w:left w:val="dashed" w:sz="4" w:space="0" w:color="D6DEE5"/>
+          <w:bottom w:val="dashed" w:sz="4" w:space="0" w:color="D6DEE5"/>
+          <w:right w:val="dashed" w:sz="4" w:space="0" w:color="D6DEE5"/>
+          <w:insideH w:val="single" w:sz="4" w:space="0" w:color="auto"/>
+          <w:insideV w:val="single" w:sz="4" w:space="0" w:color="auto"/>
+        </w:tblBorders>
+        <w:tblCellMar>
+          <w:left w:w="10" w:type="dxa"/>
+          <w:right w:w="10" w:type="dxa"/>
+        </w:tblCellMar>
+        <w:tblLook w:val="04A0" w:firstRow="1" w:lastRow="0" w:firstColumn="1" w:lastColumn="0" w:noHBand="0" w:noVBand="1"/>
+      </w:tblPr>
+      <w:tblGrid>
+        <w:gridCol w:w="9950"/>
+      </w:tblGrid>
+      <w:tr>
+        <w:trPr>
+          <w:trHeight w:val="2100"/>
+        </w:trPr>
+        <w:tc>
+          <w:tcPr>
+            <w:tcW w:w="9746" w:type="dxa"/>
+            <w:tcMar>
+              <w:top w:w="60" w:type="dxa"/>
+              <w:left w:w="100" w:type="dxa"/>
+              <w:bottom w:w="60" w:type="dxa"/>
+              <w:right w:w="100" w:type="dxa"/>
+            </w:tcMar>
+            <w:vAlign w:val="center"/>
+          </w:tcPr>
+          <w:p>
+            <w:pPr>
+              <w:spacing w:before="800" w:after="800"/>
+              <w:jc w:val="center"/>
+            </w:pPr>
+            <w:r>
+              <w:rPr>
+                <w:i/>
+                <w:iCs/>
+                <w:color w:val="8F9EAA"/>
+              </w:rPr>
+              <w:drawing>
+                <wp:inline distT="0" distB="0" distL="0" distR="0" wp14:anchorId="34D9A199" wp14:editId="1C192D92">
+                  <wp:extent cx="6188710" cy="6049010"/>
+                  <wp:effectExtent l="0" t="0" r="2540" b="8890"/>
+                  <wp:docPr id="1039506856" name="Imagen 1"/>
+                  <wp:cNvGraphicFramePr>
+                    <a:graphicFrameLocks xmlns:a="http://schemas.openxmlformats.org/drawingml/2006/main" noChangeAspect="1"/>
+                  </wp:cNvGraphicFramePr>
+                  <a:graphic xmlns:a="http://schemas.openxmlformats.org/drawingml/2006/main">
+                    <a:graphicData uri="http://schemas.openxmlformats.org/drawingml/2006/picture">
+                      <pic:pic xmlns:pic="http://schemas.openxmlformats.org/drawingml/2006/picture">
+                        <pic:nvPicPr>
+                          <pic:cNvPr id="1039506856" name=""/>
+                          <pic:cNvPicPr/>
+                        </pic:nvPicPr>
+                        <pic:blipFill>
+                          <a:blip r:embed="rId15"/>
+                          <a:stretch>
+                            <a:fillRect/>
+                          </a:stretch>
+                        </pic:blipFill>
+                        <pic:spPr>
+                          <a:xfrm>
+                            <a:off x="0" y="0"/>
+                            <a:ext cx="6188710" cy="6049010"/>
+                          </a:xfrm>
+                          <a:prstGeom prst="rect">
+                            <a:avLst/>
+                          </a:prstGeom>
+                        </pic:spPr>
+                      </pic:pic>
+                    </a:graphicData>
+                  </a:graphic>
+                </wp:inline>
+              </w:drawing>
+            </w:r>
+          </w:p>
+        </w:tc>
+      </w:tr>
+    </w:tbl>
+    <w:p>
+      <w:pPr>
+        <w:spacing w:after="160"/>
+      </w:pPr>
+    </w:p>
+    <w:p>
+      <w:pPr>
+        <w:spacing w:after="80" w:line="260" w:lineRule="auto"/>
+        <w:jc w:val="both"/>
+      </w:pPr>
+      <w:r>
+        <w:rPr>
+          <w:b/>
+          <w:bCs/>
+          <w:color w:val="D97A2B"/>
+        </w:rPr>
+        <w:t xml:space="preserve">Captura N.º 9: </w:t>
+      </w:r>
+      <w:r>
+        <w:t>salida completa de la suite con el tiempo total de ejecución visible.</w:t>
+      </w:r>
+    </w:p>
+    <w:tbl>
+      <w:tblPr>
+        <w:tblW w:w="9746" w:type="dxa"/>
+        <w:tblBorders>
+          <w:top w:val="dashed" w:sz="4" w:space="0" w:color="D6DEE5"/>
+          <w:left w:val="dashed" w:sz="4" w:space="0" w:color="D6DEE5"/>
+          <w:bottom w:val="dashed" w:sz="4" w:space="0" w:color="D6DEE5"/>
+          <w:right w:val="dashed" w:sz="4" w:space="0" w:color="D6DEE5"/>
+          <w:insideH w:val="single" w:sz="4" w:space="0" w:color="auto"/>
+          <w:insideV w:val="single" w:sz="4" w:space="0" w:color="auto"/>
+        </w:tblBorders>
+        <w:tblCellMar>
+          <w:left w:w="10" w:type="dxa"/>
+          <w:right w:w="10" w:type="dxa"/>
+        </w:tblCellMar>
+        <w:tblLook w:val="04A0" w:firstRow="1" w:lastRow="0" w:firstColumn="1" w:lastColumn="0" w:noHBand="0" w:noVBand="1"/>
+      </w:tblPr>
+      <w:tblGrid>
+        <w:gridCol w:w="9950"/>
+      </w:tblGrid>
+      <w:tr>
+        <w:trPr>
+          <w:trHeight w:val="2100"/>
+        </w:trPr>
+        <w:tc>
+          <w:tcPr>
+            <w:tcW w:w="9746" w:type="dxa"/>
+            <w:tcMar>
+              <w:top w:w="60" w:type="dxa"/>
+              <w:left w:w="100" w:type="dxa"/>
+              <w:bottom w:w="60" w:type="dxa"/>
+              <w:right w:w="100" w:type="dxa"/>
+            </w:tcMar>
+            <w:vAlign w:val="center"/>
+          </w:tcPr>
+          <w:p>
+            <w:pPr>
+              <w:spacing w:before="800" w:after="800"/>
+              <w:jc w:val="center"/>
+            </w:pPr>
+            <w:r>
+              <w:rPr>
+                <w:i/>
+                <w:iCs/>
+                <w:color w:val="8F9EAA"/>
+              </w:rPr>
+              <w:lastRenderedPageBreak/>
+              <w:drawing>
+                <wp:inline distT="0" distB="0" distL="0" distR="0" wp14:anchorId="520CD931" wp14:editId="51F51852">
+                  <wp:extent cx="6188710" cy="6049010"/>
+                  <wp:effectExtent l="0" t="0" r="2540" b="8890"/>
+                  <wp:docPr id="1489186639" name="Imagen 1"/>
+                  <wp:cNvGraphicFramePr>
+                    <a:graphicFrameLocks xmlns:a="http://schemas.openxmlformats.org/drawingml/2006/main" noChangeAspect="1"/>
+                  </wp:cNvGraphicFramePr>
+                  <a:graphic xmlns:a="http://schemas.openxmlformats.org/drawingml/2006/main">
+                    <a:graphicData uri="http://schemas.openxmlformats.org/drawingml/2006/picture">
+                      <pic:pic xmlns:pic="http://schemas.openxmlformats.org/drawingml/2006/picture">
+                        <pic:nvPicPr>
+                          <pic:cNvPr id="1489186639" name=""/>
+                          <pic:cNvPicPr/>
+                        </pic:nvPicPr>
+                        <pic:blipFill>
+                          <a:blip r:embed="rId15"/>
+                          <a:stretch>
+                            <a:fillRect/>
+                          </a:stretch>
+                        </pic:blipFill>
+                        <pic:spPr>
+                          <a:xfrm>
+                            <a:off x="0" y="0"/>
+                            <a:ext cx="6188710" cy="6049010"/>
+                          </a:xfrm>
+                          <a:prstGeom prst="rect">
+                            <a:avLst/>
+                          </a:prstGeom>
+                        </pic:spPr>
+                      </pic:pic>
+                    </a:graphicData>
+                  </a:graphic>
+                </wp:inline>
+              </w:drawing>
+            </w:r>
+          </w:p>
+        </w:tc>
+      </w:tr>
+    </w:tbl>
+    <w:p>
+      <w:pPr>
+        <w:spacing w:after="160"/>
+      </w:pPr>
+    </w:p>
+    <w:p>
+      <w:pPr>
+        <w:pBdr>
+          <w:bottom w:val="single" w:sz="6" w:space="3" w:color="D6DEE5"/>
+        </w:pBdr>
+        <w:spacing w:before="300" w:after="120"/>
+      </w:pPr>
+      <w:r>
+        <w:rPr>
+          <w:b/>
+          <w:bCs/>
+          <w:color w:val="0F3D5C"/>
+          <w:sz w:val="24"/>
+          <w:szCs w:val="24"/>
+        </w:rPr>
+        <w:t>Laboratorio 5 — Integración real con un contenedor efímero</w:t>
+      </w:r>
+    </w:p>
+    <w:p>
+      <w:pPr>
+        <w:spacing w:after="80" w:line="260" w:lineRule="auto"/>
+        <w:jc w:val="both"/>
+      </w:pPr>
+      <w:r>
+        <w:rPr>
+          <w:b/>
+          <w:bCs/>
+          <w:color w:val="D97A2B"/>
+        </w:rPr>
+        <w:t xml:space="preserve">Captura N.º 10: </w:t>
+      </w:r>
+      <w:r>
+        <w:t>las dos terminales: la suite ejecutándose y docker ps mostrando el contenedor efímero levantado por la prueba.</w:t>
+      </w:r>
+    </w:p>
+    <w:tbl>
+      <w:tblPr>
+        <w:tblW w:w="9746" w:type="dxa"/>
+        <w:tblBorders>
+          <w:top w:val="dashed" w:sz="4" w:space="0" w:color="D6DEE5"/>
+          <w:left w:val="dashed" w:sz="4" w:space="0" w:color="D6DEE5"/>
+          <w:bottom w:val="dashed" w:sz="4" w:space="0" w:color="D6DEE5"/>
+          <w:right w:val="dashed" w:sz="4" w:space="0" w:color="D6DEE5"/>
+          <w:insideH w:val="single" w:sz="4" w:space="0" w:color="auto"/>
+          <w:insideV w:val="single" w:sz="4" w:space="0" w:color="auto"/>
+        </w:tblBorders>
+        <w:tblCellMar>
+          <w:left w:w="10" w:type="dxa"/>
+          <w:right w:w="10" w:type="dxa"/>
+        </w:tblCellMar>
+        <w:tblLook w:val="04A0" w:firstRow="1" w:lastRow="0" w:firstColumn="1" w:lastColumn="0" w:noHBand="0" w:noVBand="1"/>
+      </w:tblPr>
+      <w:tblGrid>
+        <w:gridCol w:w="9950"/>
+      </w:tblGrid>
+      <w:tr>
+        <w:trPr>
+          <w:trHeight w:val="2100"/>
+        </w:trPr>
+        <w:tc>
+          <w:tcPr>
+            <w:tcW w:w="9746" w:type="dxa"/>
+            <w:tcMar>
+              <w:top w:w="60" w:type="dxa"/>
+              <w:left w:w="100" w:type="dxa"/>
+              <w:bottom w:w="60" w:type="dxa"/>
+              <w:right w:w="100" w:type="dxa"/>
+            </w:tcMar>
+            <w:vAlign w:val="center"/>
+          </w:tcPr>
+          <w:p>
+            <w:pPr>
+              <w:spacing w:before="800" w:after="800"/>
+              <w:jc w:val="center"/>
+            </w:pPr>
+            <w:r>
+              <w:rPr>
+                <w:i/>
+                <w:iCs/>
+                <w:color w:val="8F9EAA"/>
+              </w:rPr>
+              <w:lastRenderedPageBreak/>
+              <w:drawing>
+                <wp:inline distT="0" distB="0" distL="0" distR="0" wp14:anchorId="7EE7E6B9" wp14:editId="218B319B">
+                  <wp:extent cx="4656223" cy="4244708"/>
+                  <wp:effectExtent l="0" t="0" r="0" b="3810"/>
+                  <wp:docPr id="2122358820" name="Imagen 1"/>
+                  <wp:cNvGraphicFramePr>
+                    <a:graphicFrameLocks xmlns:a="http://schemas.openxmlformats.org/drawingml/2006/main" noChangeAspect="1"/>
+                  </wp:cNvGraphicFramePr>
+                  <a:graphic xmlns:a="http://schemas.openxmlformats.org/drawingml/2006/main">
+                    <a:graphicData uri="http://schemas.openxmlformats.org/drawingml/2006/picture">
+                      <pic:pic xmlns:pic="http://schemas.openxmlformats.org/drawingml/2006/picture">
+                        <pic:nvPicPr>
+                          <pic:cNvPr id="2122358820" name=""/>
+                          <pic:cNvPicPr/>
+                        </pic:nvPicPr>
+                        <pic:blipFill>
+                          <a:blip r:embed="rId16"/>
+                          <a:stretch>
+                            <a:fillRect/>
+                          </a:stretch>
+                        </pic:blipFill>
+                        <pic:spPr>
+                          <a:xfrm>
+                            <a:off x="0" y="0"/>
+                            <a:ext cx="4656223" cy="4244708"/>
+                          </a:xfrm>
+                          <a:prstGeom prst="rect">
+                            <a:avLst/>
+                          </a:prstGeom>
+                        </pic:spPr>
+                      </pic:pic>
+                    </a:graphicData>
+                  </a:graphic>
+                </wp:inline>
+              </w:drawing>
+            </w:r>
+            <w:r>
+              <w:rPr>
+                <w:noProof/>
+              </w:rPr>
+              <w:t xml:space="preserve"> </w:t>
+            </w:r>
+            <w:r>
+              <w:drawing>
+                <wp:inline distT="0" distB="0" distL="0" distR="0" wp14:anchorId="498E95F3" wp14:editId="7E1B571A">
+                  <wp:extent cx="6188710" cy="1326515"/>
+                  <wp:effectExtent l="0" t="0" r="2540" b="6985"/>
+                  <wp:docPr id="1436901873" name="Imagen 1"/>
+                  <wp:cNvGraphicFramePr>
+                    <a:graphicFrameLocks xmlns:a="http://schemas.openxmlformats.org/drawingml/2006/main" noChangeAspect="1"/>
+                  </wp:cNvGraphicFramePr>
+                  <a:graphic xmlns:a="http://schemas.openxmlformats.org/drawingml/2006/main">
+                    <a:graphicData uri="http://schemas.openxmlformats.org/drawingml/2006/picture">
+                      <pic:pic xmlns:pic="http://schemas.openxmlformats.org/drawingml/2006/picture">
+                        <pic:nvPicPr>
+                          <pic:cNvPr id="1436901873" name=""/>
+                          <pic:cNvPicPr/>
+                        </pic:nvPicPr>
+                        <pic:blipFill>
+                          <a:blip r:embed="rId17"/>
+                          <a:stretch>
+                            <a:fillRect/>
+                          </a:stretch>
+                        </pic:blipFill>
+                        <pic:spPr>
+                          <a:xfrm>
+                            <a:off x="0" y="0"/>
+                            <a:ext cx="6188710" cy="1326515"/>
+                          </a:xfrm>
+                          <a:prstGeom prst="rect">
+                            <a:avLst/>
+                          </a:prstGeom>
+                        </pic:spPr>
+                      </pic:pic>
+                    </a:graphicData>
+                  </a:graphic>
+                </wp:inline>
+              </w:drawing>
+            </w:r>
+          </w:p>
+        </w:tc>
+      </w:tr>
+    </w:tbl>
+    <w:p>
+      <w:pPr>
+        <w:spacing w:after="160"/>
+      </w:pPr>
+    </w:p>
+    <w:p>
+      <w:pPr>
+        <w:spacing w:after="80" w:line="260" w:lineRule="auto"/>
+        <w:jc w:val="both"/>
+      </w:pPr>
+      <w:r>
+        <w:rPr>
+          <w:b/>
+          <w:bCs/>
+          <w:color w:val="D97A2B"/>
+        </w:rPr>
+        <w:t xml:space="preserve">Captura N.º 11: </w:t>
+      </w:r>
+      <w:r>
+        <w:t>salida mostrando que el contenedor de la prueba ya no existe después de terminar la suite.</w:t>
+      </w:r>
+    </w:p>
+    <w:tbl>
+      <w:tblPr>
+        <w:tblW w:w="9746" w:type="dxa"/>
+        <w:tblBorders>
+          <w:top w:val="dashed" w:sz="4" w:space="0" w:color="D6DEE5"/>
+          <w:left w:val="dashed" w:sz="4" w:space="0" w:color="D6DEE5"/>
+          <w:bottom w:val="dashed" w:sz="4" w:space="0" w:color="D6DEE5"/>
+          <w:right w:val="dashed" w:sz="4" w:space="0" w:color="D6DEE5"/>
+          <w:insideH w:val="single" w:sz="4" w:space="0" w:color="auto"/>
+          <w:insideV w:val="single" w:sz="4" w:space="0" w:color="auto"/>
+        </w:tblBorders>
+        <w:tblCellMar>
+          <w:left w:w="10" w:type="dxa"/>
+          <w:right w:w="10" w:type="dxa"/>
+        </w:tblCellMar>
+        <w:tblLook w:val="04A0" w:firstRow="1" w:lastRow="0" w:firstColumn="1" w:lastColumn="0" w:noHBand="0" w:noVBand="1"/>
+      </w:tblPr>
+      <w:tblGrid>
+        <w:gridCol w:w="9950"/>
+      </w:tblGrid>
+      <w:tr>
+        <w:trPr>
+          <w:trHeight w:val="2100"/>
+        </w:trPr>
+        <w:tc>
+          <w:tcPr>
+            <w:tcW w:w="9746" w:type="dxa"/>
+            <w:tcMar>
+              <w:top w:w="60" w:type="dxa"/>
+              <w:left w:w="100" w:type="dxa"/>
+              <w:bottom w:w="60" w:type="dxa"/>
+              <w:right w:w="100" w:type="dxa"/>
+            </w:tcMar>
+            <w:vAlign w:val="center"/>
+          </w:tcPr>
+          <w:p>
+            <w:pPr>
+              <w:spacing w:before="800" w:after="800"/>
+              <w:jc w:val="center"/>
+            </w:pPr>
+            <w:r>
+              <w:rPr>
+                <w:i/>
+                <w:iCs/>
+                <w:color w:val="8F9EAA"/>
+              </w:rPr>
+              <w:lastRenderedPageBreak/>
+              <w:drawing>
+                <wp:inline distT="0" distB="0" distL="0" distR="0" wp14:anchorId="4E901EED" wp14:editId="09FF3F25">
+                  <wp:extent cx="6188710" cy="1727835"/>
+                  <wp:effectExtent l="0" t="0" r="2540" b="5715"/>
+                  <wp:docPr id="1757358079" name="Imagen 1"/>
+                  <wp:cNvGraphicFramePr>
+                    <a:graphicFrameLocks xmlns:a="http://schemas.openxmlformats.org/drawingml/2006/main" noChangeAspect="1"/>
+                  </wp:cNvGraphicFramePr>
+                  <a:graphic xmlns:a="http://schemas.openxmlformats.org/drawingml/2006/main">
+                    <a:graphicData uri="http://schemas.openxmlformats.org/drawingml/2006/picture">
+                      <pic:pic xmlns:pic="http://schemas.openxmlformats.org/drawingml/2006/picture">
+                        <pic:nvPicPr>
+                          <pic:cNvPr id="1757358079" name=""/>
+                          <pic:cNvPicPr/>
+                        </pic:nvPicPr>
+                        <pic:blipFill>
+                          <a:blip r:embed="rId18"/>
+                          <a:stretch>
+                            <a:fillRect/>
+                          </a:stretch>
+                        </pic:blipFill>
+                        <pic:spPr>
+                          <a:xfrm>
+                            <a:off x="0" y="0"/>
+                            <a:ext cx="6188710" cy="1727835"/>
+                          </a:xfrm>
+                          <a:prstGeom prst="rect">
+                            <a:avLst/>
+                          </a:prstGeom>
+                        </pic:spPr>
+                      </pic:pic>
+                    </a:graphicData>
+                  </a:graphic>
+                </wp:inline>
+              </w:drawing>
+            </w:r>
+          </w:p>
+        </w:tc>
+      </w:tr>
+    </w:tbl>
+    <w:p>
+      <w:pPr>
+        <w:spacing w:after="160"/>
+      </w:pPr>
+    </w:p>
+    <w:p>
+      <w:pPr>
+        <w:spacing w:after="80" w:line="260" w:lineRule="auto"/>
+        <w:jc w:val="both"/>
+      </w:pPr>
+      <w:r>
+        <w:rPr>
+          <w:b/>
+          <w:bCs/>
+          <w:color w:val="0F3D5C"/>
+        </w:rPr>
+        <w:t xml:space="preserve">Pregunta N.º 5. </w:t>
+      </w:r>
+      <w:r>
+        <w:rPr>
+          <w:b/>
+          <w:bCs/>
+        </w:rPr>
+        <w:t>¿Qué problema concreto evita este enfoque frente a la alternativa de que cada estudiante instale MongoDB en su propia máquina y las pruebas apunten a esa instalación?</w:t>
+      </w:r>
+    </w:p>
+    <w:tbl>
+      <w:tblPr>
+        <w:tblW w:w="9746" w:type="dxa"/>
+        <w:tblBorders>
+          <w:top w:val="single" w:sz="4" w:space="0" w:color="D6DEE5"/>
+          <w:left w:val="single" w:sz="4" w:space="0" w:color="D6DEE5"/>
+          <w:bottom w:val="single" w:sz="4" w:space="0" w:color="D6DEE5"/>
+          <w:right w:val="single" w:sz="4" w:space="0" w:color="D6DEE5"/>
+          <w:insideH w:val="single" w:sz="4" w:space="0" w:color="auto"/>
+          <w:insideV w:val="single" w:sz="4" w:space="0" w:color="auto"/>
+        </w:tblBorders>
+        <w:tblCellMar>
+          <w:left w:w="10" w:type="dxa"/>
+          <w:right w:w="10" w:type="dxa"/>
+        </w:tblCellMar>
+        <w:tblLook w:val="04A0" w:firstRow="1" w:lastRow="0" w:firstColumn="1" w:lastColumn="0" w:noHBand="0" w:noVBand="1"/>
+      </w:tblPr>
+      <w:tblGrid>
+        <w:gridCol w:w="9746"/>
+      </w:tblGrid>
+      <w:tr>
+        <w:trPr>
+          <w:trHeight w:val="1400"/>
+        </w:trPr>
+        <w:tc>
+          <w:tcPr>
+            <w:tcW w:w="9746" w:type="dxa"/>
+            <w:tcMar>
+              <w:top w:w="60" w:type="dxa"/>
+              <w:left w:w="100" w:type="dxa"/>
+              <w:bottom w:w="60" w:type="dxa"/>
+              <w:right w:w="100" w:type="dxa"/>
+            </w:tcMar>
+            <w:vAlign w:val="center"/>
+          </w:tcPr>
+          <w:p>
+            <w:r>
+              <w:t>Evita contaminar datos de una instalación local (las pruebas borran datos), garantiza la misma versión de MongoDB para todos y no requiere instalación manual. La base parte limpia, se destruye al terminar y funciona igual en cualquier máquina con Docker.</w:t>
+            </w:r>
+          </w:p>
+        </w:tc>
+      </w:tr>
+    </w:tbl>
+    <w:p>
+      <w:pPr>
+        <w:spacing w:after="160"/>
+      </w:pPr>
+    </w:p>
+    <w:p>
+      <w:pPr>
+        <w:pBdr>
+          <w:bottom w:val="single" w:sz="6" w:space="3" w:color="D6DEE5"/>
+        </w:pBdr>
+        <w:spacing w:before="300" w:after="120"/>
+      </w:pPr>
+      <w:r>
+        <w:rPr>
+          <w:b/>
+          <w:bCs/>
+          <w:color w:val="0F3D5C"/>
+          <w:sz w:val="24"/>
+          <w:szCs w:val="24"/>
+        </w:rPr>
+        <w:t>Laboratorio 6 — Prueba de contrato entre dos servicios</w:t>
+      </w:r>
+    </w:p>
+    <w:p>
+      <w:pPr>
+        <w:spacing w:after="80" w:line="260" w:lineRule="auto"/>
+        <w:jc w:val="both"/>
+      </w:pPr>
+      <w:r>
+        <w:rPr>
+          <w:b/>
+          <w:bCs/>
+          <w:color w:val="D97A2B"/>
+        </w:rPr>
+        <w:t xml:space="preserve">Captura N.º 12: </w:t>
+      </w:r>
+      <w:r>
+        <w:t>la prueba de contrato en verde junto al resto de la suite.</w:t>
+      </w:r>
+    </w:p>
+    <w:tbl>
+      <w:tblPr>
+        <w:tblW w:w="9746" w:type="dxa"/>
+        <w:tblBorders>
+          <w:top w:val="dashed" w:sz="4" w:space="0" w:color="D6DEE5"/>
+          <w:left w:val="dashed" w:sz="4" w:space="0" w:color="D6DEE5"/>
+          <w:bottom w:val="dashed" w:sz="4" w:space="0" w:color="D6DEE5"/>
+          <w:right w:val="dashed" w:sz="4" w:space="0" w:color="D6DEE5"/>
+          <w:insideH w:val="single" w:sz="4" w:space="0" w:color="auto"/>
+          <w:insideV w:val="single" w:sz="4" w:space="0" w:color="auto"/>
+        </w:tblBorders>
+        <w:tblCellMar>
+          <w:left w:w="10" w:type="dxa"/>
+          <w:right w:w="10" w:type="dxa"/>
+        </w:tblCellMar>
+        <w:tblLook w:val="04A0" w:firstRow="1" w:lastRow="0" w:firstColumn="1" w:lastColumn="0" w:noHBand="0" w:noVBand="1"/>
+      </w:tblPr>
+      <w:tblGrid>
+        <w:gridCol w:w="9950"/>
+      </w:tblGrid>
+      <w:tr>
+        <w:trPr>
+          <w:trHeight w:val="2100"/>
+        </w:trPr>
+        <w:tc>
+          <w:tcPr>
+            <w:tcW w:w="9746" w:type="dxa"/>
+            <w:tcMar>
+              <w:top w:w="60" w:type="dxa"/>
+              <w:left w:w="100" w:type="dxa"/>
+              <w:bottom w:w="60" w:type="dxa"/>
+              <w:right w:w="100" w:type="dxa"/>
+            </w:tcMar>
+            <w:vAlign w:val="center"/>
+          </w:tcPr>
+          <w:p>
+            <w:pPr>
+              <w:spacing w:before="800" w:after="800"/>
+              <w:jc w:val="center"/>
+            </w:pPr>
+            <w:r>
+              <w:rPr>
+                <w:i/>
+                <w:iCs/>
+                <w:color w:val="8F9EAA"/>
+              </w:rPr>
+              <w:lastRenderedPageBreak/>
+              <w:drawing>
+                <wp:inline distT="0" distB="0" distL="0" distR="0" wp14:anchorId="378915D2" wp14:editId="2116EE1C">
+                  <wp:extent cx="6188710" cy="6049010"/>
+                  <wp:effectExtent l="0" t="0" r="2540" b="8890"/>
+                  <wp:docPr id="1871672733" name="Imagen 1"/>
+                  <wp:cNvGraphicFramePr>
+                    <a:graphicFrameLocks xmlns:a="http://schemas.openxmlformats.org/drawingml/2006/main" noChangeAspect="1"/>
+                  </wp:cNvGraphicFramePr>
+                  <a:graphic xmlns:a="http://schemas.openxmlformats.org/drawingml/2006/main">
+                    <a:graphicData uri="http://schemas.openxmlformats.org/drawingml/2006/picture">
+                      <pic:pic xmlns:pic="http://schemas.openxmlformats.org/drawingml/2006/picture">
+                        <pic:nvPicPr>
+                          <pic:cNvPr id="1871672733" name=""/>
+                          <pic:cNvPicPr/>
+                        </pic:nvPicPr>
+                        <pic:blipFill>
+                          <a:blip r:embed="rId15"/>
+                          <a:stretch>
+                            <a:fillRect/>
+                          </a:stretch>
+                        </pic:blipFill>
+                        <pic:spPr>
+                          <a:xfrm>
+                            <a:off x="0" y="0"/>
+                            <a:ext cx="6188710" cy="6049010"/>
+                          </a:xfrm>
+                          <a:prstGeom prst="rect">
+                            <a:avLst/>
+                          </a:prstGeom>
+                        </pic:spPr>
+                      </pic:pic>
+                    </a:graphicData>
+                  </a:graphic>
+                </wp:inline>
+              </w:drawing>
+            </w:r>
+          </w:p>
+        </w:tc>
+      </w:tr>
+    </w:tbl>
+    <w:p>
+      <w:pPr>
+        <w:spacing w:after="160"/>
+      </w:pPr>
+    </w:p>
+    <w:p>
+      <w:pPr>
+        <w:spacing w:after="80" w:line="260" w:lineRule="auto"/>
+        <w:jc w:val="both"/>
+      </w:pPr>
+      <w:r>
+        <w:rPr>
+          <w:b/>
+          <w:bCs/>
+          <w:color w:val="D97A2B"/>
+        </w:rPr>
+        <w:t xml:space="preserve">Captura N.º 13: </w:t>
+      </w:r>
+      <w:r>
+        <w:t>la prueba de contrato fallando y señalando el campo faltante.</w:t>
+      </w:r>
+    </w:p>
+    <w:tbl>
+      <w:tblPr>
+        <w:tblW w:w="9746" w:type="dxa"/>
+        <w:tblBorders>
+          <w:top w:val="dashed" w:sz="4" w:space="0" w:color="D6DEE5"/>
+          <w:left w:val="dashed" w:sz="4" w:space="0" w:color="D6DEE5"/>
+          <w:bottom w:val="dashed" w:sz="4" w:space="0" w:color="D6DEE5"/>
+          <w:right w:val="dashed" w:sz="4" w:space="0" w:color="D6DEE5"/>
+          <w:insideH w:val="single" w:sz="4" w:space="0" w:color="auto"/>
+          <w:insideV w:val="single" w:sz="4" w:space="0" w:color="auto"/>
+        </w:tblBorders>
+        <w:tblCellMar>
+          <w:left w:w="10" w:type="dxa"/>
+          <w:right w:w="10" w:type="dxa"/>
+        </w:tblCellMar>
+        <w:tblLook w:val="04A0" w:firstRow="1" w:lastRow="0" w:firstColumn="1" w:lastColumn="0" w:noHBand="0" w:noVBand="1"/>
+      </w:tblPr>
+      <w:tblGrid>
+        <w:gridCol w:w="9950"/>
+      </w:tblGrid>
+      <w:tr>
+        <w:trPr>
+          <w:trHeight w:val="2100"/>
+        </w:trPr>
+        <w:tc>
+          <w:tcPr>
+            <w:tcW w:w="9746" w:type="dxa"/>
+            <w:tcMar>
+              <w:top w:w="60" w:type="dxa"/>
+              <w:left w:w="100" w:type="dxa"/>
+              <w:bottom w:w="60" w:type="dxa"/>
+              <w:right w:w="100" w:type="dxa"/>
+            </w:tcMar>
+            <w:vAlign w:val="center"/>
+          </w:tcPr>
+          <w:p>
+            <w:pPr>
+              <w:spacing w:before="800" w:after="800"/>
+              <w:jc w:val="center"/>
+            </w:pPr>
+            <w:r>
+              <w:rPr>
+                <w:i/>
+                <w:iCs/>
+                <w:color w:val="8F9EAA"/>
+              </w:rPr>
+              <w:lastRenderedPageBreak/>
+              <w:drawing>
+                <wp:inline distT="0" distB="0" distL="0" distR="0" wp14:anchorId="3BA26DD5" wp14:editId="615C5107">
+                  <wp:extent cx="6188710" cy="6383020"/>
+                  <wp:effectExtent l="0" t="0" r="2540" b="0"/>
+                  <wp:docPr id="1571342526" name="Imagen 1"/>
+                  <wp:cNvGraphicFramePr>
+                    <a:graphicFrameLocks xmlns:a="http://schemas.openxmlformats.org/drawingml/2006/main" noChangeAspect="1"/>
+                  </wp:cNvGraphicFramePr>
+                  <a:graphic xmlns:a="http://schemas.openxmlformats.org/drawingml/2006/main">
+                    <a:graphicData uri="http://schemas.openxmlformats.org/drawingml/2006/picture">
+                      <pic:pic xmlns:pic="http://schemas.openxmlformats.org/drawingml/2006/picture">
+                        <pic:nvPicPr>
+                          <pic:cNvPr id="1571342526" name=""/>
+                          <pic:cNvPicPr/>
+                        </pic:nvPicPr>
+                        <pic:blipFill>
+                          <a:blip r:embed="rId19"/>
+                          <a:stretch>
+                            <a:fillRect/>
+                          </a:stretch>
+                        </pic:blipFill>
+                        <pic:spPr>
+                          <a:xfrm>
+                            <a:off x="0" y="0"/>
+                            <a:ext cx="6188710" cy="6383020"/>
+                          </a:xfrm>
+                          <a:prstGeom prst="rect">
+                            <a:avLst/>
+                          </a:prstGeom>
+                        </pic:spPr>
+                      </pic:pic>
+                    </a:graphicData>
+                  </a:graphic>
+                </wp:inline>
+              </w:drawing>
+            </w:r>
+          </w:p>
+        </w:tc>
+      </w:tr>
+    </w:tbl>
+    <w:p>
+      <w:pPr>
+        <w:spacing w:after="160"/>
+      </w:pPr>
+    </w:p>
+    <w:p>
+      <w:pPr>
+        <w:spacing w:after="80" w:line="260" w:lineRule="auto"/>
+        <w:jc w:val="both"/>
+      </w:pPr>
+      <w:r>
+        <w:rPr>
+          <w:b/>
+          <w:bCs/>
+          <w:color w:val="0F3D5C"/>
+        </w:rPr>
+        <w:t xml:space="preserve">Pregunta N.º 6. </w:t>
+      </w:r>
+      <w:r>
+        <w:rPr>
+          <w:b/>
+          <w:bCs/>
+        </w:rPr>
+        <w:t>Las pruebas unitarias del servicio de Tareas siguieron en verde con ese cambio. ¿Por qué? ¿Qué tipo de defecto detecta la prueba de contrato que ningún otro nivel detecta?</w:t>
+      </w:r>
+    </w:p>
+    <w:tbl>
+      <w:tblPr>
+        <w:tblW w:w="9746" w:type="dxa"/>
+        <w:tblBorders>
+          <w:top w:val="single" w:sz="4" w:space="0" w:color="D6DEE5"/>
+          <w:left w:val="single" w:sz="4" w:space="0" w:color="D6DEE5"/>
+          <w:bottom w:val="single" w:sz="4" w:space="0" w:color="D6DEE5"/>
+          <w:right w:val="single" w:sz="4" w:space="0" w:color="D6DEE5"/>
+          <w:insideH w:val="single" w:sz="4" w:space="0" w:color="auto"/>
+          <w:insideV w:val="single" w:sz="4" w:space="0" w:color="auto"/>
+        </w:tblBorders>
+        <w:tblCellMar>
+          <w:left w:w="10" w:type="dxa"/>
+          <w:right w:w="10" w:type="dxa"/>
+        </w:tblCellMar>
+        <w:tblLook w:val="04A0" w:firstRow="1" w:lastRow="0" w:firstColumn="1" w:lastColumn="0" w:noHBand="0" w:noVBand="1"/>
+      </w:tblPr>
+      <w:tblGrid>
+        <w:gridCol w:w="9746"/>
+      </w:tblGrid>
+      <w:tr>
+        <w:trPr>
+          <w:trHeight w:val="1400"/>
+        </w:trPr>
+        <w:tc>
+          <w:tcPr>
+            <w:tcW w:w="9746" w:type="dxa"/>
+            <w:tcMar>
+              <w:top w:w="60" w:type="dxa"/>
+              <w:left w:w="100" w:type="dxa"/>
+              <w:bottom w:w="60" w:type="dxa"/>
+              <w:right w:w="100" w:type="dxa"/>
+            </w:tcMar>
+            <w:vAlign w:val="center"/>
+          </w:tcPr>
+          <w:p>
+            <w:r>
+              <w:lastRenderedPageBreak/>
+              <w:t>Las unitarias siguen en verde porque solo verifican la lógica interna de cada función, no la forma exacta del mensaje que se envía a otro servicio. Al renombrar creadaEn por fecha, el código sigue corriendo sin errores, así que las unitarias no lo detectan.</w:t>
+            </w:r>
+          </w:p>
+          <w:p/>
+          <w:p>
+            <w:r>
+              <w:t>La prueba de contrato detecta rupturas de compatibilidad entre servicios: campos renombrados, eliminados, cambios de tipo o de estructura. Es el único nivel que verifica que el productor siga enviando exactamente lo que el consumidor espera.</w:t>
+            </w:r>
+          </w:p>
+        </w:tc>
+      </w:tr>
+    </w:tbl>
+    <w:p>
+      <w:pPr>
+        <w:spacing w:after="160"/>
+      </w:pPr>
+    </w:p>
+    <w:p>
+      <w:pPr>
+        <w:pBdr>
+          <w:bottom w:val="single" w:sz="6" w:space="3" w:color="D6DEE5"/>
+        </w:pBdr>
+        <w:spacing w:before="300" w:after="120"/>
+      </w:pPr>
+      <w:r>
+        <w:rPr>
+          <w:b/>
+          <w:bCs/>
+          <w:color w:val="0F3D5C"/>
+          <w:sz w:val="24"/>
+          <w:szCs w:val="24"/>
+        </w:rPr>
+        <w:t>Laboratorio 7 — Dejar el proyecto listo para el pipeline</w:t>
+      </w:r>
+    </w:p>
+    <w:p>
+      <w:pPr>
+        <w:spacing w:after="80" w:line="260" w:lineRule="auto"/>
+        <w:jc w:val="both"/>
+      </w:pPr>
+      <w:r>
+        <w:rPr>
+          <w:b/>
+          <w:bCs/>
+          <w:color w:val="D97A2B"/>
+        </w:rPr>
+        <w:t xml:space="preserve">Captura N.º 14: </w:t>
+      </w:r>
+      <w:r>
+        <w:t>los dos códigos de salida: 0 con la suite en verde y distinto de 0 con la suite en rojo.</w:t>
       </w:r>
     </w:p>
     <w:tbl>
@@ -2417,12 +3412,6 @@
         <w:gridCol w:w="9746"/>
       </w:tblGrid>
       <w:tr>
-        <w:tblPrEx>
-          <w:tblCellMar>
-            <w:top w:w="0" w:type="dxa"/>
-            <w:bottom w:w="0" w:type="dxa"/>
-          </w:tblCellMar>
-        </w:tblPrEx>
         <w:trPr>
           <w:trHeight w:val="2100"/>
         </w:trPr>
@@ -2449,18 +3438,86 @@
                 <w:color w:val="8F9EAA"/>
               </w:rPr>
               <w:lastRenderedPageBreak/>
-              <w:t xml:space="preserve">[ Pegue aquí la captura de </w:t>
-            </w:r>
-            <w:proofErr w:type="gramStart"/>
-            <w:r>
-              <w:rPr>
-                <w:i/>
-                <w:iCs/>
-                <w:color w:val="8F9EAA"/>
-              </w:rPr>
-              <w:t>pantalla ]</w:t>
-            </w:r>
-            <w:proofErr w:type="gramEnd"/>
+              <w:drawing>
+                <wp:inline distT="0" distB="0" distL="0" distR="0" wp14:anchorId="0B3A05CD" wp14:editId="4BFD5227">
+                  <wp:extent cx="4572396" cy="4320914"/>
+                  <wp:effectExtent l="0" t="0" r="0" b="3810"/>
+                  <wp:docPr id="2039191249" name="Imagen 1"/>
+                  <wp:cNvGraphicFramePr>
+                    <a:graphicFrameLocks xmlns:a="http://schemas.openxmlformats.org/drawingml/2006/main" noChangeAspect="1"/>
+                  </wp:cNvGraphicFramePr>
+                  <a:graphic xmlns:a="http://schemas.openxmlformats.org/drawingml/2006/main">
+                    <a:graphicData uri="http://schemas.openxmlformats.org/drawingml/2006/picture">
+                      <pic:pic xmlns:pic="http://schemas.openxmlformats.org/drawingml/2006/picture">
+                        <pic:nvPicPr>
+                          <pic:cNvPr id="2039191249" name=""/>
+                          <pic:cNvPicPr/>
+                        </pic:nvPicPr>
+                        <pic:blipFill>
+                          <a:blip r:embed="rId20"/>
+                          <a:stretch>
+                            <a:fillRect/>
+                          </a:stretch>
+                        </pic:blipFill>
+                        <pic:spPr>
+                          <a:xfrm>
+                            <a:off x="0" y="0"/>
+                            <a:ext cx="4572396" cy="4320914"/>
+                          </a:xfrm>
+                          <a:prstGeom prst="rect">
+                            <a:avLst/>
+                          </a:prstGeom>
+                        </pic:spPr>
+                      </pic:pic>
+                    </a:graphicData>
+                  </a:graphic>
+                </wp:inline>
+              </w:drawing>
+            </w:r>
+            <w:r>
+              <w:rPr>
+                <w:noProof/>
+              </w:rPr>
+              <w:t xml:space="preserve"> </w:t>
+            </w:r>
+            <w:r>
+              <w:lastRenderedPageBreak/>
+              <w:drawing>
+                <wp:inline distT="0" distB="0" distL="0" distR="0" wp14:anchorId="45E3189B" wp14:editId="3433DE22">
+                  <wp:extent cx="4740051" cy="6721422"/>
+                  <wp:effectExtent l="0" t="0" r="3810" b="3810"/>
+                  <wp:docPr id="2096568866" name="Imagen 1"/>
+                  <wp:cNvGraphicFramePr>
+                    <a:graphicFrameLocks xmlns:a="http://schemas.openxmlformats.org/drawingml/2006/main" noChangeAspect="1"/>
+                  </wp:cNvGraphicFramePr>
+                  <a:graphic xmlns:a="http://schemas.openxmlformats.org/drawingml/2006/main">
+                    <a:graphicData uri="http://schemas.openxmlformats.org/drawingml/2006/picture">
+                      <pic:pic xmlns:pic="http://schemas.openxmlformats.org/drawingml/2006/picture">
+                        <pic:nvPicPr>
+                          <pic:cNvPr id="2096568866" name=""/>
+                          <pic:cNvPicPr/>
+                        </pic:nvPicPr>
+                        <pic:blipFill>
+                          <a:blip r:embed="rId21"/>
+                          <a:stretch>
+                            <a:fillRect/>
+                          </a:stretch>
+                        </pic:blipFill>
+                        <pic:spPr>
+                          <a:xfrm>
+                            <a:off x="0" y="0"/>
+                            <a:ext cx="4740051" cy="6721422"/>
+                          </a:xfrm>
+                          <a:prstGeom prst="rect">
+                            <a:avLst/>
+                          </a:prstGeom>
+                        </pic:spPr>
+                      </pic:pic>
+                    </a:graphicData>
+                  </a:graphic>
+                </wp:inline>
+              </w:drawing>
+            </w:r>
           </w:p>
         </w:tc>
       </w:tr>
@@ -2475,62 +3532,20 @@
         <w:spacing w:after="80" w:line="260" w:lineRule="auto"/>
         <w:jc w:val="both"/>
       </w:pPr>
-      <w:proofErr w:type="gramStart"/>
       <w:r>
         <w:rPr>
           <w:b/>
           <w:bCs/>
           <w:color w:val="0F3D5C"/>
         </w:rPr>
-        <w:t>Pregunta N.º</w:t>
-      </w:r>
-      <w:proofErr w:type="gramEnd"/>
-      <w:r>
-        <w:rPr>
-          <w:b/>
-          <w:bCs/>
-          <w:color w:val="0F3D5C"/>
-        </w:rPr>
-        <w:t xml:space="preserve"> 4. </w:t>
+        <w:t xml:space="preserve">Pregunta N.º 7. </w:t>
       </w:r>
       <w:r>
         <w:rPr>
           <w:b/>
           <w:bCs/>
         </w:rPr>
-        <w:t xml:space="preserve">Escriba una prueba que ejecute todas las líneas de </w:t>
-      </w:r>
-      <w:proofErr w:type="spellStart"/>
-      <w:r>
-        <w:rPr>
-          <w:b/>
-          <w:bCs/>
-        </w:rPr>
-        <w:t>estadoDeTarea</w:t>
-      </w:r>
-      <w:proofErr w:type="spellEnd"/>
-      <w:r>
-        <w:rPr>
-          <w:b/>
-          <w:bCs/>
-        </w:rPr>
-        <w:t xml:space="preserve"> pero que no verifique nada útil (por ejemplo, sin ningún </w:t>
-      </w:r>
-      <w:proofErr w:type="spellStart"/>
-      <w:r>
-        <w:rPr>
-          <w:b/>
-          <w:bCs/>
-        </w:rPr>
-        <w:t>expect</w:t>
-      </w:r>
-      <w:proofErr w:type="spellEnd"/>
-      <w:r>
-        <w:rPr>
-          <w:b/>
-          <w:bCs/>
-        </w:rPr>
-        <w:t xml:space="preserve"> que compare el resultado). ¿Qué cobertura reporta? ¿Qué conclusión saca sobre la cobertura como criterio de calidad?</w:t>
+        <w:t>Si una prueba es inestable (a veces pasa y a veces falla), ¿qué le ocurre al pipeline y qué le ocurre a la confianza del equipo? ¿Qué haría usted con esa prueba?</w:t>
       </w:r>
     </w:p>
     <w:tbl>
@@ -2554,12 +3569,6 @@
         <w:gridCol w:w="9746"/>
       </w:tblGrid>
       <w:tr>
-        <w:tblPrEx>
-          <w:tblCellMar>
-            <w:top w:w="0" w:type="dxa"/>
-            <w:bottom w:w="0" w:type="dxa"/>
-          </w:tblCellMar>
-        </w:tblPrEx>
         <w:trPr>
           <w:trHeight w:val="1400"/>
         </w:trPr>
@@ -2574,7 +3583,11 @@
             </w:tcMar>
             <w:vAlign w:val="center"/>
           </w:tcPr>
-          <w:p/>
+          <w:p>
+            <w:r>
+              <w:t>Si una prueba es inestable, el pipeline falla a veces sí y a veces no, y el equipo deja de confiar en él. Lo que haría: aislarla, buscar la causa, corregirla o eliminarla.</w:t>
+            </w:r>
+          </w:p>
         </w:tc>
       </w:tr>
     </w:tbl>
@@ -2582,46 +3595,6 @@
       <w:pPr>
         <w:spacing w:after="160"/>
       </w:pPr>
-    </w:p>
-    <w:p>
-      <w:pPr>
-        <w:pBdr>
-          <w:bottom w:val="single" w:sz="6" w:space="3" w:color="D6DEE5"/>
-        </w:pBdr>
-        <w:spacing w:before="300" w:after="120"/>
-      </w:pPr>
-      <w:r>
-        <w:rPr>
-          <w:b/>
-          <w:bCs/>
-          <w:color w:val="0F3D5C"/>
-          <w:sz w:val="24"/>
-          <w:szCs w:val="24"/>
-        </w:rPr>
-        <w:t xml:space="preserve">Laboratorio 4 — Probar el </w:t>
-      </w:r>
-      <w:proofErr w:type="spellStart"/>
-      <w:r>
-        <w:rPr>
-          <w:b/>
-          <w:bCs/>
-          <w:color w:val="0F3D5C"/>
-          <w:sz w:val="24"/>
-          <w:szCs w:val="24"/>
-        </w:rPr>
-        <w:t>endpoint</w:t>
-      </w:r>
-      <w:proofErr w:type="spellEnd"/>
-      <w:r>
-        <w:rPr>
-          <w:b/>
-          <w:bCs/>
-          <w:color w:val="0F3D5C"/>
-          <w:sz w:val="24"/>
-          <w:szCs w:val="24"/>
-        </w:rPr>
-        <w:t xml:space="preserve"> HTTP sin levantar el servidor</w:t>
-      </w:r>
     </w:p>
     <w:p>
       <w:pPr>
@@ -2634,18 +3607,10 @@
           <w:bCs/>
           <w:color w:val="D97A2B"/>
         </w:rPr>
-        <w:t xml:space="preserve">Captura N.º 8: </w:t>
-      </w:r>
-      <w:r>
-        <w:t xml:space="preserve">salida de </w:t>
-      </w:r>
-      <w:proofErr w:type="spellStart"/>
-      <w:r>
-        <w:t>npm</w:t>
-      </w:r>
-      <w:proofErr w:type="spellEnd"/>
-      <w:r>
-        <w:t xml:space="preserve"> test con las pruebas de la API en verde.</w:t>
+        <w:t xml:space="preserve">Captura N.º 15: </w:t>
+      </w:r>
+      <w:r>
+        <w:t>la página del repositorio en GitHub mostrando la carpeta practica7-pruebas con tests/, contratos/ y el README.</w:t>
       </w:r>
     </w:p>
     <w:tbl>
@@ -2666,15 +3631,9 @@
         <w:tblLook w:val="04A0" w:firstRow="1" w:lastRow="0" w:firstColumn="1" w:lastColumn="0" w:noHBand="0" w:noVBand="1"/>
       </w:tblPr>
       <w:tblGrid>
-        <w:gridCol w:w="9746"/>
+        <w:gridCol w:w="9950"/>
       </w:tblGrid>
       <w:tr>
-        <w:tblPrEx>
-          <w:tblCellMar>
-            <w:top w:w="0" w:type="dxa"/>
-            <w:bottom w:w="0" w:type="dxa"/>
-          </w:tblCellMar>
-        </w:tblPrEx>
         <w:trPr>
           <w:trHeight w:val="2100"/>
         </w:trPr>
@@ -2700,108 +3659,42 @@
                 <w:iCs/>
                 <w:color w:val="8F9EAA"/>
               </w:rPr>
-              <w:t xml:space="preserve">[ Pegue aquí la captura de </w:t>
-            </w:r>
-            <w:proofErr w:type="gramStart"/>
-            <w:r>
-              <w:rPr>
-                <w:i/>
-                <w:iCs/>
-                <w:color w:val="8F9EAA"/>
-              </w:rPr>
-              <w:t>pantalla ]</w:t>
-            </w:r>
-            <w:proofErr w:type="gramEnd"/>
-          </w:p>
-        </w:tc>
-      </w:tr>
-    </w:tbl>
-    <w:p>
-      <w:pPr>
-        <w:spacing w:after="160"/>
-      </w:pPr>
-    </w:p>
-    <w:p>
-      <w:pPr>
-        <w:spacing w:after="80" w:line="260" w:lineRule="auto"/>
-        <w:jc w:val="both"/>
-      </w:pPr>
-      <w:r>
-        <w:rPr>
-          <w:b/>
-          <w:bCs/>
-          <w:color w:val="D97A2B"/>
-        </w:rPr>
-        <w:t xml:space="preserve">Captura N.º 9: </w:t>
-      </w:r>
-      <w:r>
-        <w:t>salida completa de la suite con el tiempo total de ejecución visible.</w:t>
-      </w:r>
-    </w:p>
-    <w:tbl>
-      <w:tblPr>
-        <w:tblW w:w="9746" w:type="dxa"/>
-        <w:tblBorders>
-          <w:top w:val="dashed" w:sz="4" w:space="0" w:color="D6DEE5"/>
-          <w:left w:val="dashed" w:sz="4" w:space="0" w:color="D6DEE5"/>
-          <w:bottom w:val="dashed" w:sz="4" w:space="0" w:color="D6DEE5"/>
-          <w:right w:val="dashed" w:sz="4" w:space="0" w:color="D6DEE5"/>
-          <w:insideH w:val="single" w:sz="4" w:space="0" w:color="auto"/>
-          <w:insideV w:val="single" w:sz="4" w:space="0" w:color="auto"/>
-        </w:tblBorders>
-        <w:tblCellMar>
-          <w:left w:w="10" w:type="dxa"/>
-          <w:right w:w="10" w:type="dxa"/>
-        </w:tblCellMar>
-        <w:tblLook w:val="04A0" w:firstRow="1" w:lastRow="0" w:firstColumn="1" w:lastColumn="0" w:noHBand="0" w:noVBand="1"/>
-      </w:tblPr>
-      <w:tblGrid>
-        <w:gridCol w:w="9746"/>
-      </w:tblGrid>
-      <w:tr>
-        <w:tblPrEx>
-          <w:tblCellMar>
-            <w:top w:w="0" w:type="dxa"/>
-            <w:bottom w:w="0" w:type="dxa"/>
-          </w:tblCellMar>
-        </w:tblPrEx>
-        <w:trPr>
-          <w:trHeight w:val="2100"/>
-        </w:trPr>
-        <w:tc>
-          <w:tcPr>
-            <w:tcW w:w="9746" w:type="dxa"/>
-            <w:tcMar>
-              <w:top w:w="60" w:type="dxa"/>
-              <w:left w:w="100" w:type="dxa"/>
-              <w:bottom w:w="60" w:type="dxa"/>
-              <w:right w:w="100" w:type="dxa"/>
-            </w:tcMar>
-            <w:vAlign w:val="center"/>
-          </w:tcPr>
-          <w:p>
-            <w:pPr>
-              <w:spacing w:before="800" w:after="800"/>
-              <w:jc w:val="center"/>
-            </w:pPr>
-            <w:r>
-              <w:rPr>
-                <w:i/>
-                <w:iCs/>
-                <w:color w:val="8F9EAA"/>
-              </w:rPr>
-              <w:t xml:space="preserve">[ Pegue aquí la captura de </w:t>
-            </w:r>
-            <w:proofErr w:type="gramStart"/>
-            <w:r>
-              <w:rPr>
-                <w:i/>
-                <w:iCs/>
-                <w:color w:val="8F9EAA"/>
-              </w:rPr>
-              <w:t>pantalla ]</w:t>
-            </w:r>
-            <w:proofErr w:type="gramEnd"/>
+              <w:drawing>
+                <wp:inline distT="0" distB="0" distL="0" distR="0" wp14:anchorId="46742D60" wp14:editId="71FD9D5B">
+                  <wp:extent cx="6188710" cy="3207385"/>
+                  <wp:effectExtent l="0" t="0" r="2540" b="0"/>
+                  <wp:docPr id="2078587759" name="Imagen 1"/>
+                  <wp:cNvGraphicFramePr>
+                    <a:graphicFrameLocks xmlns:a="http://schemas.openxmlformats.org/drawingml/2006/main" noChangeAspect="1"/>
+                  </wp:cNvGraphicFramePr>
+                  <a:graphic xmlns:a="http://schemas.openxmlformats.org/drawingml/2006/main">
+                    <a:graphicData uri="http://schemas.openxmlformats.org/drawingml/2006/picture">
+                      <pic:pic xmlns:pic="http://schemas.openxmlformats.org/drawingml/2006/picture">
+                        <pic:nvPicPr>
+                          <pic:cNvPr id="2078587759" name=""/>
+                          <pic:cNvPicPr/>
+                        </pic:nvPicPr>
+                        <pic:blipFill>
+                          <a:blip r:embed="rId22"/>
+                          <a:stretch>
+                            <a:fillRect/>
+                          </a:stretch>
+                        </pic:blipFill>
+                        <pic:spPr>
+                          <a:xfrm>
+                            <a:off x="0" y="0"/>
+                            <a:ext cx="6188710" cy="3207385"/>
+                          </a:xfrm>
+                          <a:prstGeom prst="rect">
+                            <a:avLst/>
+                          </a:prstGeom>
+                        </pic:spPr>
+                      </pic:pic>
+                    </a:graphicData>
+                  </a:graphic>
+                </wp:inline>
+              </w:drawing>
+            </w:r>
           </w:p>
         </w:tc>
       </w:tr>
@@ -2826,235 +3719,29 @@
           <w:sz w:val="24"/>
           <w:szCs w:val="24"/>
         </w:rPr>
-        <w:t>Laboratorio 5 — Integración real con un contenedor efímero</w:t>
-      </w:r>
-    </w:p>
-    <w:p>
-      <w:pPr>
-        <w:spacing w:after="80" w:line="260" w:lineRule="auto"/>
+        <w:t>Cierre de la Parte 1</w:t>
+      </w:r>
+    </w:p>
+    <w:p>
+      <w:pPr>
+        <w:spacing w:after="100" w:line="260" w:lineRule="auto"/>
         <w:jc w:val="both"/>
       </w:pPr>
       <w:r>
-        <w:rPr>
-          <w:b/>
-          <w:bCs/>
-          <w:color w:val="D97A2B"/>
-        </w:rPr>
-        <w:t xml:space="preserve">Captura N.º 10: </w:t>
-      </w:r>
-      <w:r>
-        <w:t xml:space="preserve">las dos terminales: la suite ejecutándose y </w:t>
-      </w:r>
-      <w:proofErr w:type="spellStart"/>
-      <w:r>
-        <w:t>docker</w:t>
-      </w:r>
-      <w:proofErr w:type="spellEnd"/>
-      <w:r>
-        <w:t xml:space="preserve"> </w:t>
-      </w:r>
-      <w:proofErr w:type="spellStart"/>
-      <w:r>
-        <w:t>ps</w:t>
-      </w:r>
-      <w:proofErr w:type="spellEnd"/>
-      <w:r>
-        <w:t xml:space="preserve"> mostrando el contenedor efímero levantado por la prueba.</w:t>
-      </w:r>
-    </w:p>
-    <w:tbl>
-      <w:tblPr>
-        <w:tblW w:w="9746" w:type="dxa"/>
-        <w:tblBorders>
-          <w:top w:val="dashed" w:sz="4" w:space="0" w:color="D6DEE5"/>
-          <w:left w:val="dashed" w:sz="4" w:space="0" w:color="D6DEE5"/>
-          <w:bottom w:val="dashed" w:sz="4" w:space="0" w:color="D6DEE5"/>
-          <w:right w:val="dashed" w:sz="4" w:space="0" w:color="D6DEE5"/>
-          <w:insideH w:val="single" w:sz="4" w:space="0" w:color="auto"/>
-          <w:insideV w:val="single" w:sz="4" w:space="0" w:color="auto"/>
-        </w:tblBorders>
-        <w:tblCellMar>
-          <w:left w:w="10" w:type="dxa"/>
-          <w:right w:w="10" w:type="dxa"/>
-        </w:tblCellMar>
-        <w:tblLook w:val="04A0" w:firstRow="1" w:lastRow="0" w:firstColumn="1" w:lastColumn="0" w:noHBand="0" w:noVBand="1"/>
-      </w:tblPr>
-      <w:tblGrid>
-        <w:gridCol w:w="9746"/>
-      </w:tblGrid>
-      <w:tr>
-        <w:tblPrEx>
-          <w:tblCellMar>
-            <w:top w:w="0" w:type="dxa"/>
-            <w:bottom w:w="0" w:type="dxa"/>
-          </w:tblCellMar>
-        </w:tblPrEx>
-        <w:trPr>
-          <w:trHeight w:val="2100"/>
-        </w:trPr>
-        <w:tc>
-          <w:tcPr>
-            <w:tcW w:w="9746" w:type="dxa"/>
-            <w:tcMar>
-              <w:top w:w="60" w:type="dxa"/>
-              <w:left w:w="100" w:type="dxa"/>
-              <w:bottom w:w="60" w:type="dxa"/>
-              <w:right w:w="100" w:type="dxa"/>
-            </w:tcMar>
-            <w:vAlign w:val="center"/>
-          </w:tcPr>
-          <w:p>
-            <w:pPr>
-              <w:spacing w:before="800" w:after="800"/>
-              <w:jc w:val="center"/>
-            </w:pPr>
-            <w:r>
-              <w:rPr>
-                <w:i/>
-                <w:iCs/>
-                <w:color w:val="8F9EAA"/>
-              </w:rPr>
-              <w:lastRenderedPageBreak/>
-              <w:t xml:space="preserve">[ Pegue aquí la captura de </w:t>
-            </w:r>
-            <w:proofErr w:type="gramStart"/>
-            <w:r>
-              <w:rPr>
-                <w:i/>
-                <w:iCs/>
-                <w:color w:val="8F9EAA"/>
-              </w:rPr>
-              <w:t>pantalla ]</w:t>
-            </w:r>
-            <w:proofErr w:type="gramEnd"/>
-          </w:p>
-        </w:tc>
-      </w:tr>
-    </w:tbl>
-    <w:p>
-      <w:pPr>
-        <w:spacing w:after="160"/>
-      </w:pPr>
-    </w:p>
-    <w:p>
-      <w:pPr>
-        <w:spacing w:after="80" w:line="260" w:lineRule="auto"/>
+        <w:t>Responda brevemente antes de entregar:</w:t>
+      </w:r>
+    </w:p>
+    <w:p>
+      <w:pPr>
+        <w:spacing w:after="60" w:line="260" w:lineRule="auto"/>
         <w:jc w:val="both"/>
       </w:pPr>
-      <w:r>
-        <w:rPr>
-          <w:b/>
-          <w:bCs/>
-          <w:color w:val="D97A2B"/>
-        </w:rPr>
-        <w:t xml:space="preserve">Captura N.º 11: </w:t>
-      </w:r>
-      <w:r>
-        <w:t>salida mostrando que el contenedor de la prueba ya no existe después de terminar la suite.</w:t>
-      </w:r>
-    </w:p>
-    <w:tbl>
-      <w:tblPr>
-        <w:tblW w:w="9746" w:type="dxa"/>
-        <w:tblBorders>
-          <w:top w:val="dashed" w:sz="4" w:space="0" w:color="D6DEE5"/>
-          <w:left w:val="dashed" w:sz="4" w:space="0" w:color="D6DEE5"/>
-          <w:bottom w:val="dashed" w:sz="4" w:space="0" w:color="D6DEE5"/>
-          <w:right w:val="dashed" w:sz="4" w:space="0" w:color="D6DEE5"/>
-          <w:insideH w:val="single" w:sz="4" w:space="0" w:color="auto"/>
-          <w:insideV w:val="single" w:sz="4" w:space="0" w:color="auto"/>
-        </w:tblBorders>
-        <w:tblCellMar>
-          <w:left w:w="10" w:type="dxa"/>
-          <w:right w:w="10" w:type="dxa"/>
-        </w:tblCellMar>
-        <w:tblLook w:val="04A0" w:firstRow="1" w:lastRow="0" w:firstColumn="1" w:lastColumn="0" w:noHBand="0" w:noVBand="1"/>
-      </w:tblPr>
-      <w:tblGrid>
-        <w:gridCol w:w="9746"/>
-      </w:tblGrid>
-      <w:tr>
-        <w:tblPrEx>
-          <w:tblCellMar>
-            <w:top w:w="0" w:type="dxa"/>
-            <w:bottom w:w="0" w:type="dxa"/>
-          </w:tblCellMar>
-        </w:tblPrEx>
-        <w:trPr>
-          <w:trHeight w:val="2100"/>
-        </w:trPr>
-        <w:tc>
-          <w:tcPr>
-            <w:tcW w:w="9746" w:type="dxa"/>
-            <w:tcMar>
-              <w:top w:w="60" w:type="dxa"/>
-              <w:left w:w="100" w:type="dxa"/>
-              <w:bottom w:w="60" w:type="dxa"/>
-              <w:right w:w="100" w:type="dxa"/>
-            </w:tcMar>
-            <w:vAlign w:val="center"/>
-          </w:tcPr>
-          <w:p>
-            <w:pPr>
-              <w:spacing w:before="800" w:after="800"/>
-              <w:jc w:val="center"/>
-            </w:pPr>
-            <w:r>
-              <w:rPr>
-                <w:i/>
-                <w:iCs/>
-                <w:color w:val="8F9EAA"/>
-              </w:rPr>
-              <w:t xml:space="preserve">[ Pegue aquí la captura de </w:t>
-            </w:r>
-            <w:proofErr w:type="gramStart"/>
-            <w:r>
-              <w:rPr>
-                <w:i/>
-                <w:iCs/>
-                <w:color w:val="8F9EAA"/>
-              </w:rPr>
-              <w:t>pantalla ]</w:t>
-            </w:r>
-            <w:proofErr w:type="gramEnd"/>
-          </w:p>
-        </w:tc>
-      </w:tr>
-    </w:tbl>
-    <w:p>
-      <w:pPr>
-        <w:spacing w:after="160"/>
-      </w:pPr>
-    </w:p>
-    <w:p>
-      <w:pPr>
-        <w:spacing w:after="80" w:line="260" w:lineRule="auto"/>
-        <w:jc w:val="both"/>
-      </w:pPr>
-      <w:proofErr w:type="gramStart"/>
-      <w:r>
-        <w:rPr>
-          <w:b/>
-          <w:bCs/>
-          <w:color w:val="0F3D5C"/>
-        </w:rPr>
-        <w:t>Pregunta N.º</w:t>
-      </w:r>
-      <w:proofErr w:type="gramEnd"/>
-      <w:r>
-        <w:rPr>
-          <w:b/>
-          <w:bCs/>
-          <w:color w:val="0F3D5C"/>
-        </w:rPr>
-        <w:t xml:space="preserve"> 5. </w:t>
-      </w:r>
       <w:r>
         <w:rPr>
           <w:b/>
           <w:bCs/>
         </w:rPr>
-        <w:t>¿Qué problema concreto evita este enfoque frente a la alternativa de que cada estudiante instale MongoDB en su propia máquina y las pruebas apunten a esa instalación?</w:t>
+        <w:t>¿Qué parte de la práctica le resultó más difícil y por qué?</w:t>
       </w:r>
     </w:p>
     <w:tbl>
@@ -3078,14 +3765,8 @@
         <w:gridCol w:w="9746"/>
       </w:tblGrid>
       <w:tr>
-        <w:tblPrEx>
-          <w:tblCellMar>
-            <w:top w:w="0" w:type="dxa"/>
-            <w:bottom w:w="0" w:type="dxa"/>
-          </w:tblCellMar>
-        </w:tblPrEx>
         <w:trPr>
-          <w:trHeight w:val="1400"/>
+          <w:trHeight w:val="900"/>
         </w:trPr>
         <w:tc>
           <w:tcPr>
@@ -3098,243 +3779,30 @@
             </w:tcMar>
             <w:vAlign w:val="center"/>
           </w:tcPr>
-          <w:p/>
+          <w:p>
+            <w:r>
+              <w:t>El Laboratorio 5, porque la prueba con el contenedor efímero fallaba por incompatibilidad del driver MongoDB 7.x y tuve que diagnosticar la causa.</w:t>
+            </w:r>
+          </w:p>
         </w:tc>
       </w:tr>
     </w:tbl>
     <w:p>
       <w:pPr>
-        <w:spacing w:after="160"/>
-      </w:pPr>
-    </w:p>
-    <w:p>
-      <w:pPr>
-        <w:pBdr>
-          <w:bottom w:val="single" w:sz="6" w:space="3" w:color="D6DEE5"/>
-        </w:pBdr>
-        <w:spacing w:before="300" w:after="120"/>
-      </w:pPr>
-      <w:r>
-        <w:rPr>
-          <w:b/>
-          <w:bCs/>
-          <w:color w:val="0F3D5C"/>
-          <w:sz w:val="24"/>
-          <w:szCs w:val="24"/>
-        </w:rPr>
-        <w:t>Laboratorio 6 — Prueba de contrato entre dos servicios</w:t>
-      </w:r>
-    </w:p>
-    <w:p>
-      <w:pPr>
-        <w:spacing w:after="80" w:line="260" w:lineRule="auto"/>
+        <w:spacing w:after="140"/>
+      </w:pPr>
+    </w:p>
+    <w:p>
+      <w:pPr>
+        <w:spacing w:after="60" w:line="260" w:lineRule="auto"/>
         <w:jc w:val="both"/>
       </w:pPr>
-      <w:r>
-        <w:rPr>
-          <w:b/>
-          <w:bCs/>
-          <w:color w:val="D97A2B"/>
-        </w:rPr>
-        <w:t xml:space="preserve">Captura N.º 12: </w:t>
-      </w:r>
-      <w:r>
-        <w:t>la prueba de contrato en verde junto al resto de la suite.</w:t>
-      </w:r>
-    </w:p>
-    <w:tbl>
-      <w:tblPr>
-        <w:tblW w:w="9746" w:type="dxa"/>
-        <w:tblBorders>
-          <w:top w:val="dashed" w:sz="4" w:space="0" w:color="D6DEE5"/>
-          <w:left w:val="dashed" w:sz="4" w:space="0" w:color="D6DEE5"/>
-          <w:bottom w:val="dashed" w:sz="4" w:space="0" w:color="D6DEE5"/>
-          <w:right w:val="dashed" w:sz="4" w:space="0" w:color="D6DEE5"/>
-          <w:insideH w:val="single" w:sz="4" w:space="0" w:color="auto"/>
-          <w:insideV w:val="single" w:sz="4" w:space="0" w:color="auto"/>
-        </w:tblBorders>
-        <w:tblCellMar>
-          <w:left w:w="10" w:type="dxa"/>
-          <w:right w:w="10" w:type="dxa"/>
-        </w:tblCellMar>
-        <w:tblLook w:val="04A0" w:firstRow="1" w:lastRow="0" w:firstColumn="1" w:lastColumn="0" w:noHBand="0" w:noVBand="1"/>
-      </w:tblPr>
-      <w:tblGrid>
-        <w:gridCol w:w="9746"/>
-      </w:tblGrid>
-      <w:tr>
-        <w:tblPrEx>
-          <w:tblCellMar>
-            <w:top w:w="0" w:type="dxa"/>
-            <w:bottom w:w="0" w:type="dxa"/>
-          </w:tblCellMar>
-        </w:tblPrEx>
-        <w:trPr>
-          <w:trHeight w:val="2100"/>
-        </w:trPr>
-        <w:tc>
-          <w:tcPr>
-            <w:tcW w:w="9746" w:type="dxa"/>
-            <w:tcMar>
-              <w:top w:w="60" w:type="dxa"/>
-              <w:left w:w="100" w:type="dxa"/>
-              <w:bottom w:w="60" w:type="dxa"/>
-              <w:right w:w="100" w:type="dxa"/>
-            </w:tcMar>
-            <w:vAlign w:val="center"/>
-          </w:tcPr>
-          <w:p>
-            <w:pPr>
-              <w:spacing w:before="800" w:after="800"/>
-              <w:jc w:val="center"/>
-            </w:pPr>
-            <w:r>
-              <w:rPr>
-                <w:i/>
-                <w:iCs/>
-                <w:color w:val="8F9EAA"/>
-              </w:rPr>
-              <w:t xml:space="preserve">[ Pegue aquí la captura de </w:t>
-            </w:r>
-            <w:proofErr w:type="gramStart"/>
-            <w:r>
-              <w:rPr>
-                <w:i/>
-                <w:iCs/>
-                <w:color w:val="8F9EAA"/>
-              </w:rPr>
-              <w:t>pantalla ]</w:t>
-            </w:r>
-            <w:proofErr w:type="gramEnd"/>
-          </w:p>
-        </w:tc>
-      </w:tr>
-    </w:tbl>
-    <w:p>
-      <w:pPr>
-        <w:spacing w:after="160"/>
-      </w:pPr>
-    </w:p>
-    <w:p>
-      <w:pPr>
-        <w:spacing w:after="80" w:line="260" w:lineRule="auto"/>
-        <w:jc w:val="both"/>
-      </w:pPr>
-      <w:r>
-        <w:rPr>
-          <w:b/>
-          <w:bCs/>
-          <w:color w:val="D97A2B"/>
-        </w:rPr>
-        <w:t xml:space="preserve">Captura N.º 13: </w:t>
-      </w:r>
-      <w:r>
-        <w:t>la prueba de contrato fallando y señalando el campo faltante.</w:t>
-      </w:r>
-    </w:p>
-    <w:tbl>
-      <w:tblPr>
-        <w:tblW w:w="9746" w:type="dxa"/>
-        <w:tblBorders>
-          <w:top w:val="dashed" w:sz="4" w:space="0" w:color="D6DEE5"/>
-          <w:left w:val="dashed" w:sz="4" w:space="0" w:color="D6DEE5"/>
-          <w:bottom w:val="dashed" w:sz="4" w:space="0" w:color="D6DEE5"/>
-          <w:right w:val="dashed" w:sz="4" w:space="0" w:color="D6DEE5"/>
-          <w:insideH w:val="single" w:sz="4" w:space="0" w:color="auto"/>
-          <w:insideV w:val="single" w:sz="4" w:space="0" w:color="auto"/>
-        </w:tblBorders>
-        <w:tblCellMar>
-          <w:left w:w="10" w:type="dxa"/>
-          <w:right w:w="10" w:type="dxa"/>
-        </w:tblCellMar>
-        <w:tblLook w:val="04A0" w:firstRow="1" w:lastRow="0" w:firstColumn="1" w:lastColumn="0" w:noHBand="0" w:noVBand="1"/>
-      </w:tblPr>
-      <w:tblGrid>
-        <w:gridCol w:w="9746"/>
-      </w:tblGrid>
-      <w:tr>
-        <w:tblPrEx>
-          <w:tblCellMar>
-            <w:top w:w="0" w:type="dxa"/>
-            <w:bottom w:w="0" w:type="dxa"/>
-          </w:tblCellMar>
-        </w:tblPrEx>
-        <w:trPr>
-          <w:trHeight w:val="2100"/>
-        </w:trPr>
-        <w:tc>
-          <w:tcPr>
-            <w:tcW w:w="9746" w:type="dxa"/>
-            <w:tcMar>
-              <w:top w:w="60" w:type="dxa"/>
-              <w:left w:w="100" w:type="dxa"/>
-              <w:bottom w:w="60" w:type="dxa"/>
-              <w:right w:w="100" w:type="dxa"/>
-            </w:tcMar>
-            <w:vAlign w:val="center"/>
-          </w:tcPr>
-          <w:p>
-            <w:pPr>
-              <w:spacing w:before="800" w:after="800"/>
-              <w:jc w:val="center"/>
-            </w:pPr>
-            <w:r>
-              <w:rPr>
-                <w:i/>
-                <w:iCs/>
-                <w:color w:val="8F9EAA"/>
-              </w:rPr>
-              <w:lastRenderedPageBreak/>
-              <w:t xml:space="preserve">[ Pegue aquí la captura de </w:t>
-            </w:r>
-            <w:proofErr w:type="gramStart"/>
-            <w:r>
-              <w:rPr>
-                <w:i/>
-                <w:iCs/>
-                <w:color w:val="8F9EAA"/>
-              </w:rPr>
-              <w:t>pantalla ]</w:t>
-            </w:r>
-            <w:proofErr w:type="gramEnd"/>
-          </w:p>
-        </w:tc>
-      </w:tr>
-    </w:tbl>
-    <w:p>
-      <w:pPr>
-        <w:spacing w:after="160"/>
-      </w:pPr>
-    </w:p>
-    <w:p>
-      <w:pPr>
-        <w:spacing w:after="80" w:line="260" w:lineRule="auto"/>
-        <w:jc w:val="both"/>
-      </w:pPr>
-      <w:proofErr w:type="gramStart"/>
-      <w:r>
-        <w:rPr>
-          <w:b/>
-          <w:bCs/>
-          <w:color w:val="0F3D5C"/>
-        </w:rPr>
-        <w:t>Pregunta N.º</w:t>
-      </w:r>
-      <w:proofErr w:type="gramEnd"/>
-      <w:r>
-        <w:rPr>
-          <w:b/>
-          <w:bCs/>
-          <w:color w:val="0F3D5C"/>
-        </w:rPr>
-        <w:t xml:space="preserve"> 6. </w:t>
-      </w:r>
       <w:r>
         <w:rPr>
           <w:b/>
           <w:bCs/>
         </w:rPr>
-        <w:t>Las pruebas unitarias del servicio de Tareas siguieron en verde con ese cambio. ¿Por qué? ¿Qué tipo de defecto detecta la prueba de contrato que ningún otro nivel detecta?</w:t>
+        <w:t>¿Qué error tuvo que resolver por su cuenta y cómo lo resolvió?</w:t>
       </w:r>
     </w:p>
     <w:tbl>
@@ -3358,14 +3826,8 @@
         <w:gridCol w:w="9746"/>
       </w:tblGrid>
       <w:tr>
-        <w:tblPrEx>
-          <w:tblCellMar>
-            <w:top w:w="0" w:type="dxa"/>
-            <w:bottom w:w="0" w:type="dxa"/>
-          </w:tblCellMar>
-        </w:tblPrEx>
         <w:trPr>
-          <w:trHeight w:val="1400"/>
+          <w:trHeight w:val="900"/>
         </w:trPr>
         <w:tc>
           <w:tcPr>
@@ -3378,152 +3840,36 @@
             </w:tcMar>
             <w:vAlign w:val="center"/>
           </w:tcPr>
-          <w:p/>
+          <w:p>
+            <w:r>
+              <w:rPr>
+                <w:lang w:val="en-US"/>
+              </w:rPr>
+              <w:t xml:space="preserve">El error Missing required sub-document 'driver'. </w:t>
+            </w:r>
+            <w:r>
+              <w:t>Lo resolví degradando el driver a mongodb@6.20.0 y reinstalando las dependencias desde cero.</w:t>
+            </w:r>
+          </w:p>
         </w:tc>
       </w:tr>
     </w:tbl>
     <w:p>
       <w:pPr>
-        <w:spacing w:after="160"/>
-      </w:pPr>
-    </w:p>
-    <w:p>
-      <w:pPr>
-        <w:pBdr>
-          <w:bottom w:val="single" w:sz="6" w:space="3" w:color="D6DEE5"/>
-        </w:pBdr>
-        <w:spacing w:before="300" w:after="120"/>
-      </w:pPr>
-      <w:r>
-        <w:rPr>
-          <w:b/>
-          <w:bCs/>
-          <w:color w:val="0F3D5C"/>
-          <w:sz w:val="24"/>
-          <w:szCs w:val="24"/>
-        </w:rPr>
-        <w:t>Laboratorio 7 — Dejar el proyecto listo para el pipeline</w:t>
-      </w:r>
-    </w:p>
-    <w:p>
-      <w:pPr>
-        <w:spacing w:after="80" w:line="260" w:lineRule="auto"/>
+        <w:spacing w:after="140"/>
+      </w:pPr>
+    </w:p>
+    <w:p>
+      <w:pPr>
+        <w:spacing w:after="60" w:line="260" w:lineRule="auto"/>
         <w:jc w:val="both"/>
       </w:pPr>
-      <w:r>
-        <w:rPr>
-          <w:b/>
-          <w:bCs/>
-          <w:color w:val="D97A2B"/>
-        </w:rPr>
-        <w:t xml:space="preserve">Captura N.º 14: </w:t>
-      </w:r>
-      <w:r>
-        <w:t>los dos códigos de salida: 0 con la suite en verde y distinto de 0 con la suite en rojo.</w:t>
-      </w:r>
-    </w:p>
-    <w:tbl>
-      <w:tblPr>
-        <w:tblW w:w="9746" w:type="dxa"/>
-        <w:tblBorders>
-          <w:top w:val="dashed" w:sz="4" w:space="0" w:color="D6DEE5"/>
-          <w:left w:val="dashed" w:sz="4" w:space="0" w:color="D6DEE5"/>
-          <w:bottom w:val="dashed" w:sz="4" w:space="0" w:color="D6DEE5"/>
-          <w:right w:val="dashed" w:sz="4" w:space="0" w:color="D6DEE5"/>
-          <w:insideH w:val="single" w:sz="4" w:space="0" w:color="auto"/>
-          <w:insideV w:val="single" w:sz="4" w:space="0" w:color="auto"/>
-        </w:tblBorders>
-        <w:tblCellMar>
-          <w:left w:w="10" w:type="dxa"/>
-          <w:right w:w="10" w:type="dxa"/>
-        </w:tblCellMar>
-        <w:tblLook w:val="04A0" w:firstRow="1" w:lastRow="0" w:firstColumn="1" w:lastColumn="0" w:noHBand="0" w:noVBand="1"/>
-      </w:tblPr>
-      <w:tblGrid>
-        <w:gridCol w:w="9746"/>
-      </w:tblGrid>
-      <w:tr>
-        <w:tblPrEx>
-          <w:tblCellMar>
-            <w:top w:w="0" w:type="dxa"/>
-            <w:bottom w:w="0" w:type="dxa"/>
-          </w:tblCellMar>
-        </w:tblPrEx>
-        <w:trPr>
-          <w:trHeight w:val="2100"/>
-        </w:trPr>
-        <w:tc>
-          <w:tcPr>
-            <w:tcW w:w="9746" w:type="dxa"/>
-            <w:tcMar>
-              <w:top w:w="60" w:type="dxa"/>
-              <w:left w:w="100" w:type="dxa"/>
-              <w:bottom w:w="60" w:type="dxa"/>
-              <w:right w:w="100" w:type="dxa"/>
-            </w:tcMar>
-            <w:vAlign w:val="center"/>
-          </w:tcPr>
-          <w:p>
-            <w:pPr>
-              <w:spacing w:before="800" w:after="800"/>
-              <w:jc w:val="center"/>
-            </w:pPr>
-            <w:r>
-              <w:rPr>
-                <w:i/>
-                <w:iCs/>
-                <w:color w:val="8F9EAA"/>
-              </w:rPr>
-              <w:t xml:space="preserve">[ Pegue aquí la captura de </w:t>
-            </w:r>
-            <w:proofErr w:type="gramStart"/>
-            <w:r>
-              <w:rPr>
-                <w:i/>
-                <w:iCs/>
-                <w:color w:val="8F9EAA"/>
-              </w:rPr>
-              <w:t>pantalla ]</w:t>
-            </w:r>
-            <w:proofErr w:type="gramEnd"/>
-          </w:p>
-        </w:tc>
-      </w:tr>
-    </w:tbl>
-    <w:p>
-      <w:pPr>
-        <w:spacing w:after="160"/>
-      </w:pPr>
-    </w:p>
-    <w:p>
-      <w:pPr>
-        <w:spacing w:after="80" w:line="260" w:lineRule="auto"/>
-        <w:jc w:val="both"/>
-      </w:pPr>
-      <w:proofErr w:type="gramStart"/>
-      <w:r>
-        <w:rPr>
-          <w:b/>
-          <w:bCs/>
-          <w:color w:val="0F3D5C"/>
-        </w:rPr>
-        <w:t>Pregunta N.º</w:t>
-      </w:r>
-      <w:proofErr w:type="gramEnd"/>
-      <w:r>
-        <w:rPr>
-          <w:b/>
-          <w:bCs/>
-          <w:color w:val="0F3D5C"/>
-        </w:rPr>
-        <w:t xml:space="preserve"> 7. </w:t>
-      </w:r>
       <w:r>
         <w:rPr>
           <w:b/>
           <w:bCs/>
         </w:rPr>
-        <w:t>Si una prueba es inestable (a veces pasa y a veces falla), ¿qué le ocurre al pipeline y qué le ocurre a la confianza del equipo? ¿Qué haría usted con esa prueba?</w:t>
+        <w:t>¿Qué haría distinto si tuviera que repetir esta práctica?</w:t>
       </w:r>
     </w:p>
     <w:tbl>
@@ -3547,200 +3893,6 @@
         <w:gridCol w:w="9746"/>
       </w:tblGrid>
       <w:tr>
-        <w:tblPrEx>
-          <w:tblCellMar>
-            <w:top w:w="0" w:type="dxa"/>
-            <w:bottom w:w="0" w:type="dxa"/>
-          </w:tblCellMar>
-        </w:tblPrEx>
-        <w:trPr>
-          <w:trHeight w:val="1400"/>
-        </w:trPr>
-        <w:tc>
-          <w:tcPr>
-            <w:tcW w:w="9746" w:type="dxa"/>
-            <w:tcMar>
-              <w:top w:w="60" w:type="dxa"/>
-              <w:left w:w="100" w:type="dxa"/>
-              <w:bottom w:w="60" w:type="dxa"/>
-              <w:right w:w="100" w:type="dxa"/>
-            </w:tcMar>
-            <w:vAlign w:val="center"/>
-          </w:tcPr>
-          <w:p/>
-        </w:tc>
-      </w:tr>
-    </w:tbl>
-    <w:p>
-      <w:pPr>
-        <w:spacing w:after="160"/>
-      </w:pPr>
-    </w:p>
-    <w:p>
-      <w:pPr>
-        <w:spacing w:after="80" w:line="260" w:lineRule="auto"/>
-        <w:jc w:val="both"/>
-      </w:pPr>
-      <w:r>
-        <w:rPr>
-          <w:b/>
-          <w:bCs/>
-          <w:color w:val="D97A2B"/>
-        </w:rPr>
-        <w:t xml:space="preserve">Captura N.º 15: </w:t>
-      </w:r>
-      <w:r>
-        <w:t xml:space="preserve">la página del repositorio en GitHub mostrando la carpeta practica7-pruebas con </w:t>
-      </w:r>
-      <w:proofErr w:type="spellStart"/>
-      <w:r>
-        <w:t>tests</w:t>
-      </w:r>
-      <w:proofErr w:type="spellEnd"/>
-      <w:r>
-        <w:t>/, contratos/ y el README.</w:t>
-      </w:r>
-    </w:p>
-    <w:tbl>
-      <w:tblPr>
-        <w:tblW w:w="9746" w:type="dxa"/>
-        <w:tblBorders>
-          <w:top w:val="dashed" w:sz="4" w:space="0" w:color="D6DEE5"/>
-          <w:left w:val="dashed" w:sz="4" w:space="0" w:color="D6DEE5"/>
-          <w:bottom w:val="dashed" w:sz="4" w:space="0" w:color="D6DEE5"/>
-          <w:right w:val="dashed" w:sz="4" w:space="0" w:color="D6DEE5"/>
-          <w:insideH w:val="single" w:sz="4" w:space="0" w:color="auto"/>
-          <w:insideV w:val="single" w:sz="4" w:space="0" w:color="auto"/>
-        </w:tblBorders>
-        <w:tblCellMar>
-          <w:left w:w="10" w:type="dxa"/>
-          <w:right w:w="10" w:type="dxa"/>
-        </w:tblCellMar>
-        <w:tblLook w:val="04A0" w:firstRow="1" w:lastRow="0" w:firstColumn="1" w:lastColumn="0" w:noHBand="0" w:noVBand="1"/>
-      </w:tblPr>
-      <w:tblGrid>
-        <w:gridCol w:w="9746"/>
-      </w:tblGrid>
-      <w:tr>
-        <w:tblPrEx>
-          <w:tblCellMar>
-            <w:top w:w="0" w:type="dxa"/>
-            <w:bottom w:w="0" w:type="dxa"/>
-          </w:tblCellMar>
-        </w:tblPrEx>
-        <w:trPr>
-          <w:trHeight w:val="2100"/>
-        </w:trPr>
-        <w:tc>
-          <w:tcPr>
-            <w:tcW w:w="9746" w:type="dxa"/>
-            <w:tcMar>
-              <w:top w:w="60" w:type="dxa"/>
-              <w:left w:w="100" w:type="dxa"/>
-              <w:bottom w:w="60" w:type="dxa"/>
-              <w:right w:w="100" w:type="dxa"/>
-            </w:tcMar>
-            <w:vAlign w:val="center"/>
-          </w:tcPr>
-          <w:p>
-            <w:pPr>
-              <w:spacing w:before="800" w:after="800"/>
-              <w:jc w:val="center"/>
-            </w:pPr>
-            <w:r>
-              <w:rPr>
-                <w:i/>
-                <w:iCs/>
-                <w:color w:val="8F9EAA"/>
-              </w:rPr>
-              <w:t xml:space="preserve">[ Pegue aquí la captura de </w:t>
-            </w:r>
-            <w:proofErr w:type="gramStart"/>
-            <w:r>
-              <w:rPr>
-                <w:i/>
-                <w:iCs/>
-                <w:color w:val="8F9EAA"/>
-              </w:rPr>
-              <w:t>pantalla ]</w:t>
-            </w:r>
-            <w:proofErr w:type="gramEnd"/>
-          </w:p>
-        </w:tc>
-      </w:tr>
-    </w:tbl>
-    <w:p>
-      <w:pPr>
-        <w:spacing w:after="160"/>
-      </w:pPr>
-    </w:p>
-    <w:p>
-      <w:pPr>
-        <w:pBdr>
-          <w:bottom w:val="single" w:sz="6" w:space="3" w:color="D6DEE5"/>
-        </w:pBdr>
-        <w:spacing w:before="300" w:after="120"/>
-      </w:pPr>
-      <w:r>
-        <w:rPr>
-          <w:b/>
-          <w:bCs/>
-          <w:color w:val="0F3D5C"/>
-          <w:sz w:val="24"/>
-          <w:szCs w:val="24"/>
-        </w:rPr>
-        <w:t>Cierre de la Parte 1</w:t>
-      </w:r>
-    </w:p>
-    <w:p>
-      <w:pPr>
-        <w:spacing w:after="100" w:line="260" w:lineRule="auto"/>
-        <w:jc w:val="both"/>
-      </w:pPr>
-      <w:r>
-        <w:t>Responda brevemente antes de entregar:</w:t>
-      </w:r>
-    </w:p>
-    <w:p>
-      <w:pPr>
-        <w:spacing w:after="60" w:line="260" w:lineRule="auto"/>
-        <w:jc w:val="both"/>
-      </w:pPr>
-      <w:r>
-        <w:rPr>
-          <w:b/>
-          <w:bCs/>
-        </w:rPr>
-        <w:t>¿Qué parte de la práctica le resultó más difícil y por qué?</w:t>
-      </w:r>
-    </w:p>
-    <w:tbl>
-      <w:tblPr>
-        <w:tblW w:w="9746" w:type="dxa"/>
-        <w:tblBorders>
-          <w:top w:val="single" w:sz="4" w:space="0" w:color="D6DEE5"/>
-          <w:left w:val="single" w:sz="4" w:space="0" w:color="D6DEE5"/>
-          <w:bottom w:val="single" w:sz="4" w:space="0" w:color="D6DEE5"/>
-          <w:right w:val="single" w:sz="4" w:space="0" w:color="D6DEE5"/>
-          <w:insideH w:val="single" w:sz="4" w:space="0" w:color="auto"/>
-          <w:insideV w:val="single" w:sz="4" w:space="0" w:color="auto"/>
-        </w:tblBorders>
-        <w:tblCellMar>
-          <w:left w:w="10" w:type="dxa"/>
-          <w:right w:w="10" w:type="dxa"/>
-        </w:tblCellMar>
-        <w:tblLook w:val="04A0" w:firstRow="1" w:lastRow="0" w:firstColumn="1" w:lastColumn="0" w:noHBand="0" w:noVBand="1"/>
-      </w:tblPr>
-      <w:tblGrid>
-        <w:gridCol w:w="9746"/>
-      </w:tblGrid>
-      <w:tr>
-        <w:tblPrEx>
-          <w:tblCellMar>
-            <w:top w:w="0" w:type="dxa"/>
-            <w:bottom w:w="0" w:type="dxa"/>
-          </w:tblCellMar>
-        </w:tblPrEx>
         <w:trPr>
           <w:trHeight w:val="900"/>
         </w:trPr>
@@ -3755,133 +3907,11 @@
             </w:tcMar>
             <w:vAlign w:val="center"/>
           </w:tcPr>
-          <w:p/>
-        </w:tc>
-      </w:tr>
-    </w:tbl>
-    <w:p>
-      <w:pPr>
-        <w:spacing w:after="140"/>
-      </w:pPr>
-    </w:p>
-    <w:p>
-      <w:pPr>
-        <w:spacing w:after="60" w:line="260" w:lineRule="auto"/>
-        <w:jc w:val="both"/>
-      </w:pPr>
-      <w:r>
-        <w:rPr>
-          <w:b/>
-          <w:bCs/>
-        </w:rPr>
-        <w:t>¿Qué error tuvo que resolver por su cuenta y cómo lo resolvió?</w:t>
-      </w:r>
-    </w:p>
-    <w:tbl>
-      <w:tblPr>
-        <w:tblW w:w="9746" w:type="dxa"/>
-        <w:tblBorders>
-          <w:top w:val="single" w:sz="4" w:space="0" w:color="D6DEE5"/>
-          <w:left w:val="single" w:sz="4" w:space="0" w:color="D6DEE5"/>
-          <w:bottom w:val="single" w:sz="4" w:space="0" w:color="D6DEE5"/>
-          <w:right w:val="single" w:sz="4" w:space="0" w:color="D6DEE5"/>
-          <w:insideH w:val="single" w:sz="4" w:space="0" w:color="auto"/>
-          <w:insideV w:val="single" w:sz="4" w:space="0" w:color="auto"/>
-        </w:tblBorders>
-        <w:tblCellMar>
-          <w:left w:w="10" w:type="dxa"/>
-          <w:right w:w="10" w:type="dxa"/>
-        </w:tblCellMar>
-        <w:tblLook w:val="04A0" w:firstRow="1" w:lastRow="0" w:firstColumn="1" w:lastColumn="0" w:noHBand="0" w:noVBand="1"/>
-      </w:tblPr>
-      <w:tblGrid>
-        <w:gridCol w:w="9746"/>
-      </w:tblGrid>
-      <w:tr>
-        <w:tblPrEx>
-          <w:tblCellMar>
-            <w:top w:w="0" w:type="dxa"/>
-            <w:bottom w:w="0" w:type="dxa"/>
-          </w:tblCellMar>
-        </w:tblPrEx>
-        <w:trPr>
-          <w:trHeight w:val="900"/>
-        </w:trPr>
-        <w:tc>
-          <w:tcPr>
-            <w:tcW w:w="9746" w:type="dxa"/>
-            <w:tcMar>
-              <w:top w:w="60" w:type="dxa"/>
-              <w:left w:w="100" w:type="dxa"/>
-              <w:bottom w:w="60" w:type="dxa"/>
-              <w:right w:w="100" w:type="dxa"/>
-            </w:tcMar>
-            <w:vAlign w:val="center"/>
-          </w:tcPr>
-          <w:p/>
-        </w:tc>
-      </w:tr>
-    </w:tbl>
-    <w:p>
-      <w:pPr>
-        <w:spacing w:after="140"/>
-      </w:pPr>
-    </w:p>
-    <w:p>
-      <w:pPr>
-        <w:spacing w:after="60" w:line="260" w:lineRule="auto"/>
-        <w:jc w:val="both"/>
-      </w:pPr>
-      <w:r>
-        <w:rPr>
-          <w:b/>
-          <w:bCs/>
-        </w:rPr>
-        <w:t>¿Qué haría distinto si tuviera que repetir esta práctica?</w:t>
-      </w:r>
-    </w:p>
-    <w:tbl>
-      <w:tblPr>
-        <w:tblW w:w="9746" w:type="dxa"/>
-        <w:tblBorders>
-          <w:top w:val="single" w:sz="4" w:space="0" w:color="D6DEE5"/>
-          <w:left w:val="single" w:sz="4" w:space="0" w:color="D6DEE5"/>
-          <w:bottom w:val="single" w:sz="4" w:space="0" w:color="D6DEE5"/>
-          <w:right w:val="single" w:sz="4" w:space="0" w:color="D6DEE5"/>
-          <w:insideH w:val="single" w:sz="4" w:space="0" w:color="auto"/>
-          <w:insideV w:val="single" w:sz="4" w:space="0" w:color="auto"/>
-        </w:tblBorders>
-        <w:tblCellMar>
-          <w:left w:w="10" w:type="dxa"/>
-          <w:right w:w="10" w:type="dxa"/>
-        </w:tblCellMar>
-        <w:tblLook w:val="04A0" w:firstRow="1" w:lastRow="0" w:firstColumn="1" w:lastColumn="0" w:noHBand="0" w:noVBand="1"/>
-      </w:tblPr>
-      <w:tblGrid>
-        <w:gridCol w:w="9746"/>
-      </w:tblGrid>
-      <w:tr>
-        <w:tblPrEx>
-          <w:tblCellMar>
-            <w:top w:w="0" w:type="dxa"/>
-            <w:bottom w:w="0" w:type="dxa"/>
-          </w:tblCellMar>
-        </w:tblPrEx>
-        <w:trPr>
-          <w:trHeight w:val="900"/>
-        </w:trPr>
-        <w:tc>
-          <w:tcPr>
-            <w:tcW w:w="9746" w:type="dxa"/>
-            <w:tcMar>
-              <w:top w:w="60" w:type="dxa"/>
-              <w:left w:w="100" w:type="dxa"/>
-              <w:bottom w:w="60" w:type="dxa"/>
-              <w:right w:w="100" w:type="dxa"/>
-            </w:tcMar>
-            <w:vAlign w:val="center"/>
-          </w:tcPr>
-          <w:p/>
+          <w:p>
+            <w:r>
+              <w:t>Fijaría las versiones de las dependencias desde el inicio en package.json para evitar conflictos, y precargaría la imagen mongo:7 antes de correr la suite.</w:t>
+            </w:r>
+          </w:p>
         </w:tc>
       </w:tr>
     </w:tbl>
@@ -3916,12 +3946,6 @@
         <w:gridCol w:w="9746"/>
       </w:tblGrid>
       <w:tr>
-        <w:tblPrEx>
-          <w:tblCellMar>
-            <w:top w:w="0" w:type="dxa"/>
-            <w:bottom w:w="0" w:type="dxa"/>
-          </w:tblCellMar>
-        </w:tblPrEx>
         <w:tc>
           <w:tcPr>
             <w:tcW w:w="9746" w:type="dxa"/>
@@ -3973,12 +3997,6 @@
         <w:gridCol w:w="4873"/>
       </w:tblGrid>
       <w:tr>
-        <w:tblPrEx>
-          <w:tblCellMar>
-            <w:top w:w="0" w:type="dxa"/>
-            <w:bottom w:w="0" w:type="dxa"/>
-          </w:tblCellMar>
-        </w:tblPrEx>
         <w:tc>
           <w:tcPr>
             <w:tcW w:w="4873" w:type="dxa"/>
@@ -4049,8 +4067,8 @@
     </w:tbl>
     <w:p/>
     <w:sectPr>
-      <w:headerReference w:type="default" r:id="rId12"/>
-      <w:footerReference w:type="default" r:id="rId13"/>
+      <w:headerReference w:type="default" r:id="rId23"/>
+      <w:footerReference w:type="default" r:id="rId24"/>
       <w:pgSz w:w="11906" w:h="16838"/>
       <w:pgMar w:top="1400" w:right="1080" w:bottom="1080" w:left="1080" w:header="560" w:footer="400" w:gutter="0"/>
       <w:cols w:space="720"/>
@@ -4093,25 +4111,7 @@
         <w:sz w:val="15"/>
         <w:szCs w:val="15"/>
       </w:rPr>
-      <w:t xml:space="preserve">COM-600 Microservicios · Práctica N.º 7 · Hoja de </w:t>
-    </w:r>
-    <w:proofErr w:type="spellStart"/>
-    <w:r>
-      <w:rPr>
-        <w:color w:val="8F9EAA"/>
-        <w:sz w:val="15"/>
-        <w:szCs w:val="15"/>
-      </w:rPr>
-      <w:t>EvidenciasPágina</w:t>
-    </w:r>
-    <w:proofErr w:type="spellEnd"/>
-    <w:r>
-      <w:rPr>
-        <w:color w:val="8F9EAA"/>
-        <w:sz w:val="15"/>
-        <w:szCs w:val="15"/>
-      </w:rPr>
-      <w:t xml:space="preserve"> </w:t>
+      <w:t xml:space="preserve">COM-600 Microservicios · Práctica N.º 7 · Hoja de EvidenciasPágina </w:t>
     </w:r>
     <w:r>
       <w:rPr>
@@ -4245,12 +4245,6 @@
       <w:gridCol w:w="3346"/>
     </w:tblGrid>
     <w:tr>
-      <w:tblPrEx>
-        <w:tblCellMar>
-          <w:top w:w="0" w:type="dxa"/>
-          <w:bottom w:w="0" w:type="dxa"/>
-        </w:tblCellMar>
-      </w:tblPrEx>
       <w:tc>
         <w:tcPr>
           <w:tcW w:w="6400" w:type="dxa"/>
@@ -4303,7 +4297,6 @@
           <w:pPr>
             <w:jc w:val="right"/>
           </w:pPr>
-          <w:proofErr w:type="gramStart"/>
           <w:r>
             <w:rPr>
               <w:b/>
@@ -4312,18 +4305,7 @@
               <w:sz w:val="15"/>
               <w:szCs w:val="15"/>
             </w:rPr>
-            <w:t>PRÁCTICA N.º</w:t>
-          </w:r>
-          <w:proofErr w:type="gramEnd"/>
-          <w:r>
-            <w:rPr>
-              <w:b/>
-              <w:bCs/>
-              <w:color w:val="D97A2B"/>
-              <w:sz w:val="15"/>
-              <w:szCs w:val="15"/>
-            </w:rPr>
-            <w:t xml:space="preserve"> 7</w:t>
+            <w:t>PRÁCTICA N.º 7</w:t>
           </w:r>
         </w:p>
       </w:tc>
@@ -5130,6 +5112,60 @@
       <w:szCs w:val="20"/>
     </w:rPr>
   </w:style>
+  <w:style w:type="paragraph" w:styleId="Encabezado">
+    <w:name w:val="header"/>
+    <w:basedOn w:val="Normal"/>
+    <w:link w:val="EncabezadoCar"/>
+    <w:uiPriority w:val="99"/>
+    <w:unhideWhenUsed/>
+    <w:rsid w:val="00993A26"/>
+    <w:pPr>
+      <w:tabs>
+        <w:tab w:val="center" w:pos="4252"/>
+        <w:tab w:val="right" w:pos="8504"/>
+      </w:tabs>
+    </w:pPr>
+  </w:style>
+  <w:style w:type="character" w:customStyle="1" w:styleId="EncabezadoCar">
+    <w:name w:val="Encabezado Car"/>
+    <w:basedOn w:val="Fuentedeprrafopredeter"/>
+    <w:link w:val="Encabezado"/>
+    <w:uiPriority w:val="99"/>
+    <w:rsid w:val="00993A26"/>
+  </w:style>
+  <w:style w:type="paragraph" w:styleId="Piedepgina">
+    <w:name w:val="footer"/>
+    <w:basedOn w:val="Normal"/>
+    <w:link w:val="PiedepginaCar"/>
+    <w:uiPriority w:val="99"/>
+    <w:unhideWhenUsed/>
+    <w:rsid w:val="00993A26"/>
+    <w:pPr>
+      <w:tabs>
+        <w:tab w:val="center" w:pos="4252"/>
+        <w:tab w:val="right" w:pos="8504"/>
+      </w:tabs>
+    </w:pPr>
+  </w:style>
+  <w:style w:type="character" w:customStyle="1" w:styleId="PiedepginaCar">
+    <w:name w:val="Pie de página Car"/>
+    <w:basedOn w:val="Fuentedeprrafopredeter"/>
+    <w:link w:val="Piedepgina"/>
+    <w:uiPriority w:val="99"/>
+    <w:rsid w:val="00993A26"/>
+  </w:style>
+  <w:style w:type="character" w:styleId="Mencinsinresolver">
+    <w:name w:val="Unresolved Mention"/>
+    <w:basedOn w:val="Fuentedeprrafopredeter"/>
+    <w:uiPriority w:val="99"/>
+    <w:semiHidden/>
+    <w:unhideWhenUsed/>
+    <w:rsid w:val="009E0EEC"/>
+    <w:rPr>
+      <w:color w:val="605E5C"/>
+      <w:shd w:val="clear" w:color="auto" w:fill="E1DFDD"/>
+    </w:rPr>
+  </w:style>
 </w:styles>
 </file>
 

</xml_diff>